<commit_message>
Histoire T7 : unité 6 style T5 — organisation politique Vᵉ-XIXᵉ (2 séances, docs : kabary Callet, instructions Gallieni 1898)
Co-authored-by: arena-agent <297053741+arena-agent@users.noreply.github.com>
</commit_message>
<xml_diff>
--- a/manuel-histoire-t7/Manuel_Histoire_T7_UNITE6.docx
+++ b/manuel-histoire-t7/Manuel_Histoire_T7_UNITE6.docx
@@ -1819,152 +1819,152 @@
                 <w:szCs w:val="20"/>
                 <w:rFonts w:ascii="Times New Roman" w:cs="Times New Roman" w:eastAsia="Times New Roman" w:hAnsi="Times New Roman"/>
               </w:rPr>
-              <w:t xml:space="preserve">3. Observation</w:t>
-            </w:r>
-          </w:p>
-        </w:tc>
-        <w:tc>
-          <w:tcPr>
-            <w:tcMar>
-              <w:top w:type="dxa" w:w="80"/>
-              <w:left w:type="dxa" w:w="80"/>
-              <w:bottom w:type="dxa" w:w="80"/>
-              <w:right w:type="dxa" w:w="80"/>
-            </w:tcMar>
-          </w:tcPr>
-          <w:p>
-            <w:pPr>
-              <w:spacing w:after="40"/>
-              <w:jc w:val="left"/>
-            </w:pPr>
-            <w:r>
-              <w:rPr>
-                <w:b w:val="false"/>
-                <w:bCs w:val="false"/>
-                <w:i w:val="false"/>
-                <w:iCs w:val="false"/>
-                <w:color w:val="000000"/>
-                <w:sz w:val="20"/>
-                <w:szCs w:val="20"/>
-                <w:rFonts w:ascii="Times New Roman" w:cs="Times New Roman" w:eastAsia="Times New Roman" w:hAnsi="Times New Roman"/>
-              </w:rPr>
-              <w:t xml:space="preserve">Ratsimilaho unifie les clans de la côte Est vers 1712 : on passe de clans dispersés à un royaume betsimisaraka — l’exemple parfait de la troisième marche. Un siècle plus tard, Radama Iᵉʳ franchit la quatrième.</w:t>
-            </w:r>
-          </w:p>
-        </w:tc>
-        <w:tc>
-          <w:tcPr>
-            <w:tcMar>
-              <w:top w:type="dxa" w:w="80"/>
-              <w:left w:type="dxa" w:w="80"/>
-              <w:bottom w:type="dxa" w:w="80"/>
-              <w:right w:type="dxa" w:w="80"/>
-            </w:tcMar>
-          </w:tcPr>
-          <w:p>
-            <w:pPr>
-              <w:spacing w:after="40"/>
-              <w:jc w:val="left"/>
-            </w:pPr>
-            <w:r>
-              <w:rPr>
-                <w:b w:val="false"/>
-                <w:bCs w:val="false"/>
-                <w:i w:val="false"/>
-                <w:iCs w:val="false"/>
-                <w:color w:val="000000"/>
-                <w:sz w:val="20"/>
-                <w:szCs w:val="20"/>
-                <w:rFonts w:ascii="Times New Roman" w:cs="Times New Roman" w:eastAsia="Times New Roman" w:hAnsi="Times New Roman"/>
-              </w:rPr>
-              <w:t xml:space="preserve">Observent l’exemple résolu.</w:t>
-            </w:r>
-          </w:p>
-        </w:tc>
-        <w:tc>
-          <w:tcPr>
-            <w:tcMar>
-              <w:top w:type="dxa" w:w="80"/>
-              <w:left w:type="dxa" w:w="80"/>
-              <w:bottom w:type="dxa" w:w="80"/>
-              <w:right w:type="dxa" w:w="80"/>
-            </w:tcMar>
-          </w:tcPr>
-          <w:p>
-            <w:pPr>
-              <w:spacing w:after="40"/>
-              <w:jc w:val="left"/>
-            </w:pPr>
-            <w:r>
-              <w:rPr>
-                <w:b w:val="false"/>
-                <w:bCs w:val="false"/>
-                <w:i w:val="false"/>
-                <w:iCs w:val="false"/>
-                <w:color w:val="000000"/>
-                <w:sz w:val="20"/>
-                <w:szCs w:val="20"/>
-                <w:rFonts w:ascii="Times New Roman" w:cs="Times New Roman" w:eastAsia="Times New Roman" w:hAnsi="Times New Roman"/>
-              </w:rPr>
-              <w:t xml:space="preserve">Observation dirigée</w:t>
-            </w:r>
-          </w:p>
-        </w:tc>
-        <w:tc>
-          <w:tcPr>
-            <w:tcMar>
-              <w:top w:type="dxa" w:w="80"/>
-              <w:left w:type="dxa" w:w="80"/>
-              <w:bottom w:type="dxa" w:w="80"/>
-              <w:right w:type="dxa" w:w="80"/>
-            </w:tcMar>
-          </w:tcPr>
-          <w:p>
-            <w:pPr>
-              <w:spacing w:after="40"/>
-              <w:jc w:val="left"/>
-            </w:pPr>
-            <w:r>
-              <w:rPr>
-                <w:b w:val="false"/>
-                <w:bCs w:val="false"/>
-                <w:i w:val="false"/>
-                <w:iCs w:val="false"/>
-                <w:color w:val="000000"/>
-                <w:sz w:val="20"/>
-                <w:szCs w:val="20"/>
-                <w:rFonts w:ascii="Times New Roman" w:cs="Times New Roman" w:eastAsia="Times New Roman" w:hAnsi="Times New Roman"/>
-              </w:rPr>
-              <w:t xml:space="preserve">Document imprimé</w:t>
-            </w:r>
-          </w:p>
-        </w:tc>
-        <w:tc>
-          <w:tcPr>
-            <w:tcMar>
-              <w:top w:type="dxa" w:w="80"/>
-              <w:left w:type="dxa" w:w="80"/>
-              <w:bottom w:type="dxa" w:w="80"/>
-              <w:right w:type="dxa" w:w="80"/>
-            </w:tcMar>
-          </w:tcPr>
-          <w:p>
-            <w:pPr>
-              <w:spacing w:after="40"/>
-              <w:jc w:val="left"/>
-            </w:pPr>
-            <w:r>
-              <w:rPr>
-                <w:b w:val="false"/>
-                <w:bCs w:val="false"/>
-                <w:i w:val="false"/>
-                <w:iCs w:val="false"/>
-                <w:color w:val="000000"/>
-                <w:sz w:val="20"/>
-                <w:szCs w:val="20"/>
-                <w:rFonts w:ascii="Times New Roman" w:cs="Times New Roman" w:eastAsia="Times New Roman" w:hAnsi="Times New Roman"/>
-              </w:rPr>
-              <w:t xml:space="preserve">Compréhension</w:t>
+              <w:t xml:space="preserve">3. Développement</w:t>
+            </w:r>
+          </w:p>
+        </w:tc>
+        <w:tc>
+          <w:tcPr>
+            <w:tcMar>
+              <w:top w:type="dxa" w:w="80"/>
+              <w:left w:type="dxa" w:w="80"/>
+              <w:bottom w:type="dxa" w:w="80"/>
+              <w:right w:type="dxa" w:w="80"/>
+            </w:tcMar>
+          </w:tcPr>
+          <w:p>
+            <w:pPr>
+              <w:spacing w:after="40"/>
+              <w:jc w:val="left"/>
+            </w:pPr>
+            <w:r>
+              <w:rPr>
+                <w:b w:val="false"/>
+                <w:bCs w:val="false"/>
+                <w:i w:val="false"/>
+                <w:iCs w:val="false"/>
+                <w:color w:val="000000"/>
+                <w:sz w:val="20"/>
+                <w:szCs w:val="20"/>
+                <w:rFonts w:ascii="Times New Roman" w:cs="Times New Roman" w:eastAsia="Times New Roman" w:hAnsi="Times New Roman"/>
+              </w:rPr>
+              <w:t xml:space="preserve">Développe la leçon partie par partie : Les deux premières marches : clan et confédérations ; Troisième marche : les royaumes malgaches (1500-1810) ; Quatrième marche : le Royaume de Madagascar (1810-1896).</w:t>
+            </w:r>
+          </w:p>
+        </w:tc>
+        <w:tc>
+          <w:tcPr>
+            <w:tcMar>
+              <w:top w:type="dxa" w:w="80"/>
+              <w:left w:type="dxa" w:w="80"/>
+              <w:bottom w:type="dxa" w:w="80"/>
+              <w:right w:type="dxa" w:w="80"/>
+            </w:tcMar>
+          </w:tcPr>
+          <w:p>
+            <w:pPr>
+              <w:spacing w:after="40"/>
+              <w:jc w:val="left"/>
+            </w:pPr>
+            <w:r>
+              <w:rPr>
+                <w:b w:val="false"/>
+                <w:bCs w:val="false"/>
+                <w:i w:val="false"/>
+                <w:iCs w:val="false"/>
+                <w:color w:val="000000"/>
+                <w:sz w:val="20"/>
+                <w:szCs w:val="20"/>
+                <w:rFonts w:ascii="Times New Roman" w:cs="Times New Roman" w:eastAsia="Times New Roman" w:hAnsi="Times New Roman"/>
+              </w:rPr>
+              <w:t xml:space="preserve">Écoutent, répondent aux questions et notent les mots-clés.</w:t>
+            </w:r>
+          </w:p>
+        </w:tc>
+        <w:tc>
+          <w:tcPr>
+            <w:tcMar>
+              <w:top w:type="dxa" w:w="80"/>
+              <w:left w:type="dxa" w:w="80"/>
+              <w:bottom w:type="dxa" w:w="80"/>
+              <w:right w:type="dxa" w:w="80"/>
+            </w:tcMar>
+          </w:tcPr>
+          <w:p>
+            <w:pPr>
+              <w:spacing w:after="40"/>
+              <w:jc w:val="left"/>
+            </w:pPr>
+            <w:r>
+              <w:rPr>
+                <w:b w:val="false"/>
+                <w:bCs w:val="false"/>
+                <w:i w:val="false"/>
+                <w:iCs w:val="false"/>
+                <w:color w:val="000000"/>
+                <w:sz w:val="20"/>
+                <w:szCs w:val="20"/>
+                <w:rFonts w:ascii="Times New Roman" w:cs="Times New Roman" w:eastAsia="Times New Roman" w:hAnsi="Times New Roman"/>
+              </w:rPr>
+              <w:t xml:space="preserve">Exposé interactif, questions-réponses</w:t>
+            </w:r>
+          </w:p>
+        </w:tc>
+        <w:tc>
+          <w:tcPr>
+            <w:tcMar>
+              <w:top w:type="dxa" w:w="80"/>
+              <w:left w:type="dxa" w:w="80"/>
+              <w:bottom w:type="dxa" w:w="80"/>
+              <w:right w:type="dxa" w:w="80"/>
+            </w:tcMar>
+          </w:tcPr>
+          <w:p>
+            <w:pPr>
+              <w:spacing w:after="40"/>
+              <w:jc w:val="left"/>
+            </w:pPr>
+            <w:r>
+              <w:rPr>
+                <w:b w:val="false"/>
+                <w:bCs w:val="false"/>
+                <w:i w:val="false"/>
+                <w:iCs w:val="false"/>
+                <w:color w:val="000000"/>
+                <w:sz w:val="20"/>
+                <w:szCs w:val="20"/>
+                <w:rFonts w:ascii="Times New Roman" w:cs="Times New Roman" w:eastAsia="Times New Roman" w:hAnsi="Times New Roman"/>
+              </w:rPr>
+              <w:t xml:space="preserve">Tableau, frises, cartes</w:t>
+            </w:r>
+          </w:p>
+        </w:tc>
+        <w:tc>
+          <w:tcPr>
+            <w:tcMar>
+              <w:top w:type="dxa" w:w="80"/>
+              <w:left w:type="dxa" w:w="80"/>
+              <w:bottom w:type="dxa" w:w="80"/>
+              <w:right w:type="dxa" w:w="80"/>
+            </w:tcMar>
+          </w:tcPr>
+          <w:p>
+            <w:pPr>
+              <w:spacing w:after="40"/>
+              <w:jc w:val="left"/>
+            </w:pPr>
+            <w:r>
+              <w:rPr>
+                <w:b w:val="false"/>
+                <w:bCs w:val="false"/>
+                <w:i w:val="false"/>
+                <w:iCs w:val="false"/>
+                <w:color w:val="000000"/>
+                <w:sz w:val="20"/>
+                <w:szCs w:val="20"/>
+                <w:rFonts w:ascii="Times New Roman" w:cs="Times New Roman" w:eastAsia="Times New Roman" w:hAnsi="Times New Roman"/>
+              </w:rPr>
+              <w:t xml:space="preserve">Attention, participation</w:t>
             </w:r>
           </w:p>
         </w:tc>
@@ -1995,152 +1995,152 @@
                 <w:szCs w:val="20"/>
                 <w:rFonts w:ascii="Times New Roman" w:cs="Times New Roman" w:eastAsia="Times New Roman" w:hAnsi="Times New Roman"/>
               </w:rPr>
-              <w:t xml:space="preserve">4. Analyse</w:t>
-            </w:r>
-          </w:p>
-        </w:tc>
-        <w:tc>
-          <w:tcPr>
-            <w:tcMar>
-              <w:top w:type="dxa" w:w="80"/>
-              <w:left w:type="dxa" w:w="80"/>
-              <w:bottom w:type="dxa" w:w="80"/>
-              <w:right w:type="dxa" w:w="80"/>
-            </w:tcMar>
-          </w:tcPr>
-          <w:p>
-            <w:pPr>
-              <w:spacing w:after="40"/>
-              <w:jc w:val="left"/>
-            </w:pPr>
-            <w:r>
-              <w:rPr>
-                <w:b w:val="false"/>
-                <w:bCs w:val="false"/>
-                <w:i w:val="false"/>
-                <w:iCs w:val="false"/>
-                <w:color w:val="000000"/>
-                <w:sz w:val="20"/>
-                <w:szCs w:val="20"/>
-                <w:rFonts w:ascii="Times New Roman" w:cs="Times New Roman" w:eastAsia="Times New Roman" w:hAnsi="Times New Roman"/>
-              </w:rPr>
-              <w:t xml:space="preserve">Guide l’analyse : Le clan d’abord (Vᵉ-XVIᵉ siècle) : un groupe de familles descendant d’un ancêtre commun, installé sur un territoire ; le chef de clan — souvent l’aîné le plus sage — rend la justice, répartit les terres, préside les rites ; l’économie est villageoise : riz, zébus, entraide. Puis les clans voisins s’allient — contre un danger, pour un mariage, autour d’un marché : ce sont les confédérations claniques, dirigées par un roitelet, chef reconnu par plusieurs clans ; le pouvoir se concentre, des capitales naissent sur les collines fortifiées. Troisième marche (1500-1810) : les royaumes malgaches — le royaume sakalava du Menabe puis du Boina à l’Ouest, le royaume betsimisaraka unifié par Ratsimilaho à l’Est, les royaumes betsileo du centre-sud, le royaume merina des hautes terres, réunifié par Andrianampoinimerina (vers 1787-1810) depuis Ambohimanga... Chaque royaume a ses institutions : souverain sacré, conseillers, tributs, armée, grands marchés ; selon les régions, des personnages marquants réalisent de grandes œuvres — digues et rizières d’Andrianampoinimerina, fédération côtière de Ratsimilaho, puissance maritime sakalava. Dernière marche : en 1810, Radama Iᵉʳ succède à son père Andrianampoinimerina ; armé, allié aux Britanniques, il étend son autorité sur la majeure partie de l’île : les traités internationaux le reconnaissent roi de Madagascar — le Royaume de Madagascar (1810-1896) est un État au sens plein : lois écrites, ministères, armée de métier, diplomatie, écoles. Attention à la différence : LES royaumes malgaches (pluriel, régionaux, rivaux) et LE Royaume de Madagascar (singulier, englobant, reconnu). Cette marche vers l’unité, brisée en 1896 par la colonisation, a préparé la nation d’aujourd’hui.</w:t>
-            </w:r>
-          </w:p>
-        </w:tc>
-        <w:tc>
-          <w:tcPr>
-            <w:tcMar>
-              <w:top w:type="dxa" w:w="80"/>
-              <w:left w:type="dxa" w:w="80"/>
-              <w:bottom w:type="dxa" w:w="80"/>
-              <w:right w:type="dxa" w:w="80"/>
-            </w:tcMar>
-          </w:tcPr>
-          <w:p>
-            <w:pPr>
-              <w:spacing w:after="40"/>
-              <w:jc w:val="left"/>
-            </w:pPr>
-            <w:r>
-              <w:rPr>
-                <w:b w:val="false"/>
-                <w:bCs w:val="false"/>
-                <w:i w:val="false"/>
-                <w:iCs w:val="false"/>
-                <w:color w:val="000000"/>
-                <w:sz w:val="20"/>
-                <w:szCs w:val="20"/>
-                <w:rFonts w:ascii="Times New Roman" w:cs="Times New Roman" w:eastAsia="Times New Roman" w:hAnsi="Times New Roman"/>
-              </w:rPr>
-              <w:t xml:space="preserve">Expliquent la démarche et vérifient le résultat.</w:t>
-            </w:r>
-          </w:p>
-        </w:tc>
-        <w:tc>
-          <w:tcPr>
-            <w:tcMar>
-              <w:top w:type="dxa" w:w="80"/>
-              <w:left w:type="dxa" w:w="80"/>
-              <w:bottom w:type="dxa" w:w="80"/>
-              <w:right w:type="dxa" w:w="80"/>
-            </w:tcMar>
-          </w:tcPr>
-          <w:p>
-            <w:pPr>
-              <w:spacing w:after="40"/>
-              <w:jc w:val="left"/>
-            </w:pPr>
-            <w:r>
-              <w:rPr>
-                <w:b w:val="false"/>
-                <w:bCs w:val="false"/>
-                <w:i w:val="false"/>
-                <w:iCs w:val="false"/>
-                <w:color w:val="000000"/>
-                <w:sz w:val="20"/>
-                <w:szCs w:val="20"/>
-                <w:rFonts w:ascii="Times New Roman" w:cs="Times New Roman" w:eastAsia="Times New Roman" w:hAnsi="Times New Roman"/>
-              </w:rPr>
-              <w:t xml:space="preserve">Recherche en binômes</w:t>
-            </w:r>
-          </w:p>
-        </w:tc>
-        <w:tc>
-          <w:tcPr>
-            <w:tcMar>
-              <w:top w:type="dxa" w:w="80"/>
-              <w:left w:type="dxa" w:w="80"/>
-              <w:bottom w:type="dxa" w:w="80"/>
-              <w:right w:type="dxa" w:w="80"/>
-            </w:tcMar>
-          </w:tcPr>
-          <w:p>
-            <w:pPr>
-              <w:spacing w:after="40"/>
-              <w:jc w:val="left"/>
-            </w:pPr>
-            <w:r>
-              <w:rPr>
-                <w:b w:val="false"/>
-                <w:bCs w:val="false"/>
-                <w:i w:val="false"/>
-                <w:iCs w:val="false"/>
-                <w:color w:val="000000"/>
-                <w:sz w:val="20"/>
-                <w:szCs w:val="20"/>
-                <w:rFonts w:ascii="Times New Roman" w:cs="Times New Roman" w:eastAsia="Times New Roman" w:hAnsi="Times New Roman"/>
-              </w:rPr>
-              <w:t xml:space="preserve">Documents, cartes, frises</w:t>
-            </w:r>
-          </w:p>
-        </w:tc>
-        <w:tc>
-          <w:tcPr>
-            <w:tcMar>
-              <w:top w:type="dxa" w:w="80"/>
-              <w:left w:type="dxa" w:w="80"/>
-              <w:bottom w:type="dxa" w:w="80"/>
-              <w:right w:type="dxa" w:w="80"/>
-            </w:tcMar>
-          </w:tcPr>
-          <w:p>
-            <w:pPr>
-              <w:spacing w:after="40"/>
-              <w:jc w:val="left"/>
-            </w:pPr>
-            <w:r>
-              <w:rPr>
-                <w:b w:val="false"/>
-                <w:bCs w:val="false"/>
-                <w:i w:val="false"/>
-                <w:iCs w:val="false"/>
-                <w:color w:val="000000"/>
-                <w:sz w:val="20"/>
-                <w:szCs w:val="20"/>
-                <w:rFonts w:ascii="Times New Roman" w:cs="Times New Roman" w:eastAsia="Times New Roman" w:hAnsi="Times New Roman"/>
-              </w:rPr>
-              <w:t xml:space="preserve">Raisonnement</w:t>
+              <w:t xml:space="preserve">4. Étude de document</w:t>
+            </w:r>
+          </w:p>
+        </w:tc>
+        <w:tc>
+          <w:tcPr>
+            <w:tcMar>
+              <w:top w:type="dxa" w:w="80"/>
+              <w:left w:type="dxa" w:w="80"/>
+              <w:bottom w:type="dxa" w:w="80"/>
+              <w:right w:type="dxa" w:w="80"/>
+            </w:tcMar>
+          </w:tcPr>
+          <w:p>
+            <w:pPr>
+              <w:spacing w:after="40"/>
+              <w:jc w:val="left"/>
+            </w:pPr>
+            <w:r>
+              <w:rPr>
+                <w:b w:val="false"/>
+                <w:bCs w:val="false"/>
+                <w:i w:val="false"/>
+                <w:iCs w:val="false"/>
+                <w:color w:val="000000"/>
+                <w:sz w:val="20"/>
+                <w:szCs w:val="20"/>
+                <w:rFonts w:ascii="Times New Roman" w:cs="Times New Roman" w:eastAsia="Times New Roman" w:hAnsi="Times New Roman"/>
+              </w:rPr>
+              <w:t xml:space="preserve">Fait lire le document « « La mer est la limite de ma rizière » » (d’après le kabary d’Andrianampoinimerina rapporté dans le Tantara ny Andriana du R.P. Callet (1878) — extrait adapté), puis pose les questions.</w:t>
+            </w:r>
+          </w:p>
+        </w:tc>
+        <w:tc>
+          <w:tcPr>
+            <w:tcMar>
+              <w:top w:type="dxa" w:w="80"/>
+              <w:left w:type="dxa" w:w="80"/>
+              <w:bottom w:type="dxa" w:w="80"/>
+              <w:right w:type="dxa" w:w="80"/>
+            </w:tcMar>
+          </w:tcPr>
+          <w:p>
+            <w:pPr>
+              <w:spacing w:after="40"/>
+              <w:jc w:val="left"/>
+            </w:pPr>
+            <w:r>
+              <w:rPr>
+                <w:b w:val="false"/>
+                <w:bCs w:val="false"/>
+                <w:i w:val="false"/>
+                <w:iCs w:val="false"/>
+                <w:color w:val="000000"/>
+                <w:sz w:val="20"/>
+                <w:szCs w:val="20"/>
+                <w:rFonts w:ascii="Times New Roman" w:cs="Times New Roman" w:eastAsia="Times New Roman" w:hAnsi="Times New Roman"/>
+              </w:rPr>
+              <w:t xml:space="preserve">Lisent le document, répondent aux questions et critiquent la source.</w:t>
+            </w:r>
+          </w:p>
+        </w:tc>
+        <w:tc>
+          <w:tcPr>
+            <w:tcMar>
+              <w:top w:type="dxa" w:w="80"/>
+              <w:left w:type="dxa" w:w="80"/>
+              <w:bottom w:type="dxa" w:w="80"/>
+              <w:right w:type="dxa" w:w="80"/>
+            </w:tcMar>
+          </w:tcPr>
+          <w:p>
+            <w:pPr>
+              <w:spacing w:after="40"/>
+              <w:jc w:val="left"/>
+            </w:pPr>
+            <w:r>
+              <w:rPr>
+                <w:b w:val="false"/>
+                <w:bCs w:val="false"/>
+                <w:i w:val="false"/>
+                <w:iCs w:val="false"/>
+                <w:color w:val="000000"/>
+                <w:sz w:val="20"/>
+                <w:szCs w:val="20"/>
+                <w:rFonts w:ascii="Times New Roman" w:cs="Times New Roman" w:eastAsia="Times New Roman" w:hAnsi="Times New Roman"/>
+              </w:rPr>
+              <w:t xml:space="preserve">Observation dirigée, travail en binômes</w:t>
+            </w:r>
+          </w:p>
+        </w:tc>
+        <w:tc>
+          <w:tcPr>
+            <w:tcMar>
+              <w:top w:type="dxa" w:w="80"/>
+              <w:left w:type="dxa" w:w="80"/>
+              <w:bottom w:type="dxa" w:w="80"/>
+              <w:right w:type="dxa" w:w="80"/>
+            </w:tcMar>
+          </w:tcPr>
+          <w:p>
+            <w:pPr>
+              <w:spacing w:after="40"/>
+              <w:jc w:val="left"/>
+            </w:pPr>
+            <w:r>
+              <w:rPr>
+                <w:b w:val="false"/>
+                <w:bCs w:val="false"/>
+                <w:i w:val="false"/>
+                <w:iCs w:val="false"/>
+                <w:color w:val="000000"/>
+                <w:sz w:val="20"/>
+                <w:szCs w:val="20"/>
+                <w:rFonts w:ascii="Times New Roman" w:cs="Times New Roman" w:eastAsia="Times New Roman" w:hAnsi="Times New Roman"/>
+              </w:rPr>
+              <w:t xml:space="preserve">Document imprimé</w:t>
+            </w:r>
+          </w:p>
+        </w:tc>
+        <w:tc>
+          <w:tcPr>
+            <w:tcMar>
+              <w:top w:type="dxa" w:w="80"/>
+              <w:left w:type="dxa" w:w="80"/>
+              <w:bottom w:type="dxa" w:w="80"/>
+              <w:right w:type="dxa" w:w="80"/>
+            </w:tcMar>
+          </w:tcPr>
+          <w:p>
+            <w:pPr>
+              <w:spacing w:after="40"/>
+              <w:jc w:val="left"/>
+            </w:pPr>
+            <w:r>
+              <w:rPr>
+                <w:b w:val="false"/>
+                <w:bCs w:val="false"/>
+                <w:i w:val="false"/>
+                <w:iCs w:val="false"/>
+                <w:color w:val="000000"/>
+                <w:sz w:val="20"/>
+                <w:szCs w:val="20"/>
+                <w:rFonts w:ascii="Times New Roman" w:cs="Times New Roman" w:eastAsia="Times New Roman" w:hAnsi="Times New Roman"/>
+              </w:rPr>
+              <w:t xml:space="preserve">Esprit critique</w:t>
             </w:r>
           </w:p>
         </w:tc>
@@ -2746,7 +2746,26 @@
     </w:p>
     <w:p>
       <w:pPr>
-        <w:spacing w:after="110" w:line="300"/>
+        <w:spacing w:after="160" w:line="300"/>
+        <w:jc w:val="center"/>
+      </w:pPr>
+      <w:r>
+        <w:rPr>
+          <w:b w:val="false"/>
+          <w:bCs w:val="false"/>
+          <w:i/>
+          <w:iCs/>
+          <w:color w:val="000000"/>
+          <w:sz w:val="21"/>
+          <w:szCs w:val="21"/>
+          <w:rFonts w:ascii="Times New Roman" w:cs="Times New Roman" w:eastAsia="Times New Roman" w:hAnsi="Times New Roman"/>
+        </w:rPr>
+        <w:t xml:space="preserve">Du clan familial autour d’un ancien à l’État royal recevant les ambassadeurs : quinze siècles en quatre marches.</w:t>
+      </w:r>
+    </w:p>
+    <w:p>
+      <w:pPr>
+        <w:spacing w:after="80" w:line="300"/>
         <w:jc w:val="both"/>
       </w:pPr>
       <w:r>
@@ -2756,11 +2775,30 @@
           <w:i w:val="false"/>
           <w:iCs w:val="false"/>
           <w:color w:val="2E7D32"/>
-          <w:sz w:val="24"/>
-          <w:szCs w:val="24"/>
-          <w:rFonts w:ascii="Times New Roman" w:cs="Times New Roman" w:eastAsia="Times New Roman" w:hAnsi="Times New Roman"/>
-        </w:rPr>
-        <w:t xml:space="preserve">Définition — </w:t>
+          <w:sz w:val="26"/>
+          <w:szCs w:val="26"/>
+          <w:rFonts w:ascii="Times New Roman" w:cs="Times New Roman" w:eastAsia="Times New Roman" w:hAnsi="Times New Roman"/>
+        </w:rPr>
+        <w:t xml:space="preserve">1. Les deux premières marches : clan et confédérations</w:t>
+      </w:r>
+    </w:p>
+    <w:p>
+      <w:pPr>
+        <w:spacing w:after="100" w:line="300"/>
+        <w:jc w:val="both"/>
+      </w:pPr>
+      <w:r>
+        <w:rPr>
+          <w:b w:val="false"/>
+          <w:bCs w:val="false"/>
+          <w:i w:val="false"/>
+          <w:iCs w:val="false"/>
+          <w:color w:val="000000"/>
+          <w:sz w:val="24"/>
+          <w:szCs w:val="24"/>
+          <w:rFonts w:ascii="Times New Roman" w:cs="Times New Roman" w:eastAsia="Times New Roman" w:hAnsi="Times New Roman"/>
+        </w:rPr>
+        <w:t xml:space="preserve">Le </w:t>
       </w:r>
       <w:r>
         <w:rPr>
@@ -2768,19 +2806,26 @@
           <w:bCs/>
           <w:i w:val="false"/>
           <w:iCs w:val="false"/>
+          <w:color w:val="1F4E79"/>
+          <w:sz w:val="24"/>
+          <w:szCs w:val="24"/>
+          <w:rFonts w:ascii="Times New Roman" w:cs="Times New Roman" w:eastAsia="Times New Roman" w:hAnsi="Times New Roman"/>
+        </w:rPr>
+        <w:t xml:space="preserve">clan</w:t>
+      </w:r>
+      <w:r>
+        <w:rPr>
+          <w:b w:val="false"/>
+          <w:bCs w:val="false"/>
+          <w:i w:val="false"/>
+          <w:iCs w:val="false"/>
           <w:color w:val="000000"/>
           <w:sz w:val="24"/>
           <w:szCs w:val="24"/>
           <w:rFonts w:ascii="Times New Roman" w:cs="Times New Roman" w:eastAsia="Times New Roman" w:hAnsi="Times New Roman"/>
         </w:rPr>
-        <w:t xml:space="preserve">L’organisation politique de Madagascar a évolué en quatre étapes : le clan (du Vᵉ au XVIᵉ siècle), dirigé par un chef de clan ; les confédérations claniques, unions de clans sous un roitelet ; les royaumes malgaches (1500 à 1810), États régionaux rivaux ; et le Royaume de Madagascar à partir du règne de Radama Iᵉʳ (1810-1896), qui unifie la plus grande partie de l’île en un seul État.</w:t>
-      </w:r>
-    </w:p>
-    <w:p>
-      <w:pPr>
-        <w:spacing w:after="110" w:line="300"/>
-        <w:jc w:val="both"/>
-      </w:pPr>
+        <w:t xml:space="preserve"> d’abord (Vᵉ-XVIᵉ siècle) : un groupe de familles descendant d’un ancêtre commun, installé sur un territoire ; le </w:t>
+      </w:r>
       <w:r>
         <w:rPr>
           <w:b/>
@@ -2792,7 +2837,7 @@
           <w:szCs w:val="24"/>
           <w:rFonts w:ascii="Times New Roman" w:cs="Times New Roman" w:eastAsia="Times New Roman" w:hAnsi="Times New Roman"/>
         </w:rPr>
-        <w:t xml:space="preserve">Autrement dit : </w:t>
+        <w:t xml:space="preserve">chef de clan</w:t>
       </w:r>
       <w:r>
         <w:rPr>
@@ -2805,12 +2850,12 @@
           <w:szCs w:val="24"/>
           <w:rFonts w:ascii="Times New Roman" w:cs="Times New Roman" w:eastAsia="Times New Roman" w:hAnsi="Times New Roman"/>
         </w:rPr>
-        <w:t xml:space="preserve">familles → clans → unions de clans → royaumes régionaux → un royaume pour presque toute l’île : à chaque marche, le pouvoir s’étend et s’organise davantage.</w:t>
-      </w:r>
-    </w:p>
-    <w:p>
-      <w:pPr>
-        <w:spacing w:after="110" w:line="300"/>
+        <w:t xml:space="preserve"> — souvent l’aîné le plus sage — rend la justice, répartit les terres, préside les rites ; l’économie est villageoise : riz, zébus, entraide.</w:t>
+      </w:r>
+    </w:p>
+    <w:p>
+      <w:pPr>
+        <w:spacing w:after="100" w:line="300"/>
         <w:jc w:val="both"/>
       </w:pPr>
       <w:r>
@@ -2824,7 +2869,516 @@
           <w:szCs w:val="24"/>
           <w:rFonts w:ascii="Times New Roman" w:cs="Times New Roman" w:eastAsia="Times New Roman" w:hAnsi="Times New Roman"/>
         </w:rPr>
-        <w:t xml:space="preserve">Le clan d’abord (Vᵉ-XVIᵉ siècle) : un groupe de familles descendant d’un ancêtre commun, installé sur un territoire ; le chef de clan — souvent l’aîné le plus sage — rend la justice, répartit les terres, préside les rites ; l’économie est villageoise : riz, zébus, entraide. Puis les clans voisins s’allient — contre un danger, pour un mariage, autour d’un marché : ce sont les confédérations claniques, dirigées par un roitelet, chef reconnu par plusieurs clans ; le pouvoir se concentre, des capitales naissent sur les collines fortifiées. Troisième marche (1500-1810) : les royaumes malgaches — le royaume sakalava du Menabe puis du Boina à l’Ouest, le royaume betsimisaraka unifié par Ratsimilaho à l’Est, les royaumes betsileo du centre-sud, le royaume merina des hautes terres, réunifié par Andrianampoinimerina (vers 1787-1810) depuis Ambohimanga... Chaque royaume a ses institutions : souverain sacré, conseillers, tributs, armée, grands marchés ; selon les régions, des personnages marquants réalisent de grandes œuvres — digues et rizières d’Andrianampoinimerina, fédération côtière de Ratsimilaho, puissance maritime sakalava. Dernière marche : en 1810, Radama Iᵉʳ succède à son père Andrianampoinimerina ; armé, allié aux Britanniques, il étend son autorité sur la majeure partie de l’île : les traités internationaux le reconnaissent roi de Madagascar — le Royaume de Madagascar (1810-1896) est un État au sens plein : lois écrites, ministères, armée de métier, diplomatie, écoles. Attention à la différence : LES royaumes malgaches (pluriel, régionaux, rivaux) et LE Royaume de Madagascar (singulier, englobant, reconnu). Cette marche vers l’unité, brisée en 1896 par la colonisation, a préparé la nation d’aujourd’hui.</w:t>
+        <w:t xml:space="preserve">Puis les </w:t>
+      </w:r>
+      <w:r>
+        <w:rPr>
+          <w:b/>
+          <w:bCs/>
+          <w:i w:val="false"/>
+          <w:iCs w:val="false"/>
+          <w:color w:val="1F4E79"/>
+          <w:sz w:val="24"/>
+          <w:szCs w:val="24"/>
+          <w:rFonts w:ascii="Times New Roman" w:cs="Times New Roman" w:eastAsia="Times New Roman" w:hAnsi="Times New Roman"/>
+        </w:rPr>
+        <w:t xml:space="preserve">clan</w:t>
+      </w:r>
+      <w:r>
+        <w:rPr>
+          <w:b w:val="false"/>
+          <w:bCs w:val="false"/>
+          <w:i w:val="false"/>
+          <w:iCs w:val="false"/>
+          <w:color w:val="000000"/>
+          <w:sz w:val="24"/>
+          <w:szCs w:val="24"/>
+          <w:rFonts w:ascii="Times New Roman" w:cs="Times New Roman" w:eastAsia="Times New Roman" w:hAnsi="Times New Roman"/>
+        </w:rPr>
+        <w:t xml:space="preserve">s voisins s’allient — contre un danger, pour un mariage, autour d’un marché : ce sont les </w:t>
+      </w:r>
+      <w:r>
+        <w:rPr>
+          <w:b/>
+          <w:bCs/>
+          <w:i w:val="false"/>
+          <w:iCs w:val="false"/>
+          <w:color w:val="1F4E79"/>
+          <w:sz w:val="24"/>
+          <w:szCs w:val="24"/>
+          <w:rFonts w:ascii="Times New Roman" w:cs="Times New Roman" w:eastAsia="Times New Roman" w:hAnsi="Times New Roman"/>
+        </w:rPr>
+        <w:t xml:space="preserve">confédérations claniques</w:t>
+      </w:r>
+      <w:r>
+        <w:rPr>
+          <w:b w:val="false"/>
+          <w:bCs w:val="false"/>
+          <w:i w:val="false"/>
+          <w:iCs w:val="false"/>
+          <w:color w:val="000000"/>
+          <w:sz w:val="24"/>
+          <w:szCs w:val="24"/>
+          <w:rFonts w:ascii="Times New Roman" w:cs="Times New Roman" w:eastAsia="Times New Roman" w:hAnsi="Times New Roman"/>
+        </w:rPr>
+        <w:t xml:space="preserve">, dirigées par un </w:t>
+      </w:r>
+      <w:r>
+        <w:rPr>
+          <w:b/>
+          <w:bCs/>
+          <w:i w:val="false"/>
+          <w:iCs w:val="false"/>
+          <w:color w:val="1F4E79"/>
+          <w:sz w:val="24"/>
+          <w:szCs w:val="24"/>
+          <w:rFonts w:ascii="Times New Roman" w:cs="Times New Roman" w:eastAsia="Times New Roman" w:hAnsi="Times New Roman"/>
+        </w:rPr>
+        <w:t xml:space="preserve">roitelet</w:t>
+      </w:r>
+      <w:r>
+        <w:rPr>
+          <w:b w:val="false"/>
+          <w:bCs w:val="false"/>
+          <w:i w:val="false"/>
+          <w:iCs w:val="false"/>
+          <w:color w:val="000000"/>
+          <w:sz w:val="24"/>
+          <w:szCs w:val="24"/>
+          <w:rFonts w:ascii="Times New Roman" w:cs="Times New Roman" w:eastAsia="Times New Roman" w:hAnsi="Times New Roman"/>
+        </w:rPr>
+        <w:t xml:space="preserve">, chef reconnu par plusieurs </w:t>
+      </w:r>
+      <w:r>
+        <w:rPr>
+          <w:b/>
+          <w:bCs/>
+          <w:i w:val="false"/>
+          <w:iCs w:val="false"/>
+          <w:color w:val="1F4E79"/>
+          <w:sz w:val="24"/>
+          <w:szCs w:val="24"/>
+          <w:rFonts w:ascii="Times New Roman" w:cs="Times New Roman" w:eastAsia="Times New Roman" w:hAnsi="Times New Roman"/>
+        </w:rPr>
+        <w:t xml:space="preserve">clan</w:t>
+      </w:r>
+      <w:r>
+        <w:rPr>
+          <w:b w:val="false"/>
+          <w:bCs w:val="false"/>
+          <w:i w:val="false"/>
+          <w:iCs w:val="false"/>
+          <w:color w:val="000000"/>
+          <w:sz w:val="24"/>
+          <w:szCs w:val="24"/>
+          <w:rFonts w:ascii="Times New Roman" w:cs="Times New Roman" w:eastAsia="Times New Roman" w:hAnsi="Times New Roman"/>
+        </w:rPr>
+        <w:t xml:space="preserve">s ; le pouvoir se concentre, des capitales naissent sur les collines fortifiées.</w:t>
+      </w:r>
+    </w:p>
+    <w:p>
+      <w:pPr>
+        <w:spacing w:after="80" w:line="300"/>
+        <w:jc w:val="both"/>
+      </w:pPr>
+      <w:r>
+        <w:rPr>
+          <w:b/>
+          <w:bCs/>
+          <w:i w:val="false"/>
+          <w:iCs w:val="false"/>
+          <w:color w:val="2E7D32"/>
+          <w:sz w:val="26"/>
+          <w:szCs w:val="26"/>
+          <w:rFonts w:ascii="Times New Roman" w:cs="Times New Roman" w:eastAsia="Times New Roman" w:hAnsi="Times New Roman"/>
+        </w:rPr>
+        <w:t xml:space="preserve">2. Troisième marche : les royaumes malgaches (1500-1810)</w:t>
+      </w:r>
+    </w:p>
+    <w:p>
+      <w:pPr>
+        <w:spacing w:after="100" w:line="300"/>
+        <w:jc w:val="both"/>
+      </w:pPr>
+      <w:r>
+        <w:rPr>
+          <w:b w:val="false"/>
+          <w:bCs w:val="false"/>
+          <w:i w:val="false"/>
+          <w:iCs w:val="false"/>
+          <w:color w:val="000000"/>
+          <w:sz w:val="24"/>
+          <w:szCs w:val="24"/>
+          <w:rFonts w:ascii="Times New Roman" w:cs="Times New Roman" w:eastAsia="Times New Roman" w:hAnsi="Times New Roman"/>
+        </w:rPr>
+        <w:t xml:space="preserve">Des </w:t>
+      </w:r>
+      <w:r>
+        <w:rPr>
+          <w:b/>
+          <w:bCs/>
+          <w:i w:val="false"/>
+          <w:iCs w:val="false"/>
+          <w:color w:val="1F4E79"/>
+          <w:sz w:val="24"/>
+          <w:szCs w:val="24"/>
+          <w:rFonts w:ascii="Times New Roman" w:cs="Times New Roman" w:eastAsia="Times New Roman" w:hAnsi="Times New Roman"/>
+        </w:rPr>
+        <w:t xml:space="preserve">État</w:t>
+      </w:r>
+      <w:r>
+        <w:rPr>
+          <w:b w:val="false"/>
+          <w:bCs w:val="false"/>
+          <w:i w:val="false"/>
+          <w:iCs w:val="false"/>
+          <w:color w:val="000000"/>
+          <w:sz w:val="24"/>
+          <w:szCs w:val="24"/>
+          <w:rFonts w:ascii="Times New Roman" w:cs="Times New Roman" w:eastAsia="Times New Roman" w:hAnsi="Times New Roman"/>
+        </w:rPr>
+        <w:t xml:space="preserve">s régionaux rivaux se constituent :</w:t>
+      </w:r>
+    </w:p>
+    <w:p>
+      <w:pPr>
+        <w:spacing w:after="60" w:line="300"/>
+        <w:jc w:val="both"/>
+      </w:pPr>
+      <w:r>
+        <w:rPr>
+          <w:b w:val="false"/>
+          <w:bCs w:val="false"/>
+          <w:i w:val="false"/>
+          <w:iCs w:val="false"/>
+          <w:color w:val="000000"/>
+          <w:sz w:val="24"/>
+          <w:szCs w:val="24"/>
+          <w:rFonts w:ascii="Times New Roman" w:cs="Times New Roman" w:eastAsia="Times New Roman" w:hAnsi="Times New Roman"/>
+        </w:rPr>
+        <w:t xml:space="preserve">• le royaume sakalava du Menabe puis du Boina à l’Ouest, puissance maritime ;</w:t>
+      </w:r>
+    </w:p>
+    <w:p>
+      <w:pPr>
+        <w:spacing w:after="60" w:line="300"/>
+        <w:jc w:val="both"/>
+      </w:pPr>
+      <w:r>
+        <w:rPr>
+          <w:b w:val="false"/>
+          <w:bCs w:val="false"/>
+          <w:i w:val="false"/>
+          <w:iCs w:val="false"/>
+          <w:color w:val="000000"/>
+          <w:sz w:val="24"/>
+          <w:szCs w:val="24"/>
+          <w:rFonts w:ascii="Times New Roman" w:cs="Times New Roman" w:eastAsia="Times New Roman" w:hAnsi="Times New Roman"/>
+        </w:rPr>
+        <w:t xml:space="preserve">• le royaume betsimisaraka, unifié par </w:t>
+      </w:r>
+      <w:r>
+        <w:rPr>
+          <w:b/>
+          <w:bCs/>
+          <w:i w:val="false"/>
+          <w:iCs w:val="false"/>
+          <w:color w:val="1F4E79"/>
+          <w:sz w:val="24"/>
+          <w:szCs w:val="24"/>
+          <w:rFonts w:ascii="Times New Roman" w:cs="Times New Roman" w:eastAsia="Times New Roman" w:hAnsi="Times New Roman"/>
+        </w:rPr>
+        <w:t xml:space="preserve">Ratsimilaho</w:t>
+      </w:r>
+      <w:r>
+        <w:rPr>
+          <w:b w:val="false"/>
+          <w:bCs w:val="false"/>
+          <w:i w:val="false"/>
+          <w:iCs w:val="false"/>
+          <w:color w:val="000000"/>
+          <w:sz w:val="24"/>
+          <w:szCs w:val="24"/>
+          <w:rFonts w:ascii="Times New Roman" w:cs="Times New Roman" w:eastAsia="Times New Roman" w:hAnsi="Times New Roman"/>
+        </w:rPr>
+        <w:t xml:space="preserve"> à l’Est vers 1712 ;</w:t>
+      </w:r>
+    </w:p>
+    <w:p>
+      <w:pPr>
+        <w:spacing w:after="60" w:line="300"/>
+        <w:jc w:val="both"/>
+      </w:pPr>
+      <w:r>
+        <w:rPr>
+          <w:b w:val="false"/>
+          <w:bCs w:val="false"/>
+          <w:i w:val="false"/>
+          <w:iCs w:val="false"/>
+          <w:color w:val="000000"/>
+          <w:sz w:val="24"/>
+          <w:szCs w:val="24"/>
+          <w:rFonts w:ascii="Times New Roman" w:cs="Times New Roman" w:eastAsia="Times New Roman" w:hAnsi="Times New Roman"/>
+        </w:rPr>
+        <w:t xml:space="preserve">• les royaumes betsileo du centre-sud ;</w:t>
+      </w:r>
+    </w:p>
+    <w:p>
+      <w:pPr>
+        <w:spacing w:after="60" w:line="300"/>
+        <w:jc w:val="both"/>
+      </w:pPr>
+      <w:r>
+        <w:rPr>
+          <w:b w:val="false"/>
+          <w:bCs w:val="false"/>
+          <w:i w:val="false"/>
+          <w:iCs w:val="false"/>
+          <w:color w:val="000000"/>
+          <w:sz w:val="24"/>
+          <w:szCs w:val="24"/>
+          <w:rFonts w:ascii="Times New Roman" w:cs="Times New Roman" w:eastAsia="Times New Roman" w:hAnsi="Times New Roman"/>
+        </w:rPr>
+        <w:t xml:space="preserve">• le royaume merina des hautes terres, réunifié par </w:t>
+      </w:r>
+      <w:r>
+        <w:rPr>
+          <w:b/>
+          <w:bCs/>
+          <w:i w:val="false"/>
+          <w:iCs w:val="false"/>
+          <w:color w:val="1F4E79"/>
+          <w:sz w:val="24"/>
+          <w:szCs w:val="24"/>
+          <w:rFonts w:ascii="Times New Roman" w:cs="Times New Roman" w:eastAsia="Times New Roman" w:hAnsi="Times New Roman"/>
+        </w:rPr>
+        <w:t xml:space="preserve">Andrianampoinimerina</w:t>
+      </w:r>
+      <w:r>
+        <w:rPr>
+          <w:b w:val="false"/>
+          <w:bCs w:val="false"/>
+          <w:i w:val="false"/>
+          <w:iCs w:val="false"/>
+          <w:color w:val="000000"/>
+          <w:sz w:val="24"/>
+          <w:szCs w:val="24"/>
+          <w:rFonts w:ascii="Times New Roman" w:cs="Times New Roman" w:eastAsia="Times New Roman" w:hAnsi="Times New Roman"/>
+        </w:rPr>
+        <w:t xml:space="preserve"> (vers 1787-1810) depuis Ambohimanga — digues, rizières et grands kabary.</w:t>
+      </w:r>
+    </w:p>
+    <w:p>
+      <w:pPr>
+        <w:spacing w:after="80" w:line="300"/>
+        <w:jc w:val="both"/>
+      </w:pPr>
+      <w:r>
+        <w:rPr>
+          <w:b/>
+          <w:bCs/>
+          <w:i w:val="false"/>
+          <w:iCs w:val="false"/>
+          <w:color w:val="2E7D32"/>
+          <w:sz w:val="26"/>
+          <w:szCs w:val="26"/>
+          <w:rFonts w:ascii="Times New Roman" w:cs="Times New Roman" w:eastAsia="Times New Roman" w:hAnsi="Times New Roman"/>
+        </w:rPr>
+        <w:t xml:space="preserve">3. Quatrième marche : le Royaume de Madagascar (1810-1896)</w:t>
+      </w:r>
+    </w:p>
+    <w:p>
+      <w:pPr>
+        <w:spacing w:after="100" w:line="300"/>
+        <w:jc w:val="both"/>
+      </w:pPr>
+      <w:r>
+        <w:rPr>
+          <w:b w:val="false"/>
+          <w:bCs w:val="false"/>
+          <w:i w:val="false"/>
+          <w:iCs w:val="false"/>
+          <w:color w:val="000000"/>
+          <w:sz w:val="24"/>
+          <w:szCs w:val="24"/>
+          <w:rFonts w:ascii="Times New Roman" w:cs="Times New Roman" w:eastAsia="Times New Roman" w:hAnsi="Times New Roman"/>
+        </w:rPr>
+        <w:t xml:space="preserve">Chaque royaume avait ses institutions : souverain sacré, conseillers, tributs, armée, grands marchés. En 1810, </w:t>
+      </w:r>
+      <w:r>
+        <w:rPr>
+          <w:b/>
+          <w:bCs/>
+          <w:i w:val="false"/>
+          <w:iCs w:val="false"/>
+          <w:color w:val="1F4E79"/>
+          <w:sz w:val="24"/>
+          <w:szCs w:val="24"/>
+          <w:rFonts w:ascii="Times New Roman" w:cs="Times New Roman" w:eastAsia="Times New Roman" w:hAnsi="Times New Roman"/>
+        </w:rPr>
+        <w:t xml:space="preserve">Radama Iᵉʳ</w:t>
+      </w:r>
+      <w:r>
+        <w:rPr>
+          <w:b w:val="false"/>
+          <w:bCs w:val="false"/>
+          <w:i w:val="false"/>
+          <w:iCs w:val="false"/>
+          <w:color w:val="000000"/>
+          <w:sz w:val="24"/>
+          <w:szCs w:val="24"/>
+          <w:rFonts w:ascii="Times New Roman" w:cs="Times New Roman" w:eastAsia="Times New Roman" w:hAnsi="Times New Roman"/>
+        </w:rPr>
+        <w:t xml:space="preserve"> succède à son père </w:t>
+      </w:r>
+      <w:r>
+        <w:rPr>
+          <w:b/>
+          <w:bCs/>
+          <w:i w:val="false"/>
+          <w:iCs w:val="false"/>
+          <w:color w:val="1F4E79"/>
+          <w:sz w:val="24"/>
+          <w:szCs w:val="24"/>
+          <w:rFonts w:ascii="Times New Roman" w:cs="Times New Roman" w:eastAsia="Times New Roman" w:hAnsi="Times New Roman"/>
+        </w:rPr>
+        <w:t xml:space="preserve">Andrianampoinimerina</w:t>
+      </w:r>
+      <w:r>
+        <w:rPr>
+          <w:b w:val="false"/>
+          <w:bCs w:val="false"/>
+          <w:i w:val="false"/>
+          <w:iCs w:val="false"/>
+          <w:color w:val="000000"/>
+          <w:sz w:val="24"/>
+          <w:szCs w:val="24"/>
+          <w:rFonts w:ascii="Times New Roman" w:cs="Times New Roman" w:eastAsia="Times New Roman" w:hAnsi="Times New Roman"/>
+        </w:rPr>
+        <w:t xml:space="preserve"> ; armé, allié aux Britanniques, il étend son autorité sur la majeure partie de l’île : les traités internationaux le reconnaissent roi de Madagascar. Le </w:t>
+      </w:r>
+      <w:r>
+        <w:rPr>
+          <w:b/>
+          <w:bCs/>
+          <w:i w:val="false"/>
+          <w:iCs w:val="false"/>
+          <w:color w:val="1F4E79"/>
+          <w:sz w:val="24"/>
+          <w:szCs w:val="24"/>
+          <w:rFonts w:ascii="Times New Roman" w:cs="Times New Roman" w:eastAsia="Times New Roman" w:hAnsi="Times New Roman"/>
+        </w:rPr>
+        <w:t xml:space="preserve">Royaume de Madagascar</w:t>
+      </w:r>
+      <w:r>
+        <w:rPr>
+          <w:b w:val="false"/>
+          <w:bCs w:val="false"/>
+          <w:i w:val="false"/>
+          <w:iCs w:val="false"/>
+          <w:color w:val="000000"/>
+          <w:sz w:val="24"/>
+          <w:szCs w:val="24"/>
+          <w:rFonts w:ascii="Times New Roman" w:cs="Times New Roman" w:eastAsia="Times New Roman" w:hAnsi="Times New Roman"/>
+        </w:rPr>
+        <w:t xml:space="preserve"> (1810-1896) est un </w:t>
+      </w:r>
+      <w:r>
+        <w:rPr>
+          <w:b/>
+          <w:bCs/>
+          <w:i w:val="false"/>
+          <w:iCs w:val="false"/>
+          <w:color w:val="1F4E79"/>
+          <w:sz w:val="24"/>
+          <w:szCs w:val="24"/>
+          <w:rFonts w:ascii="Times New Roman" w:cs="Times New Roman" w:eastAsia="Times New Roman" w:hAnsi="Times New Roman"/>
+        </w:rPr>
+        <w:t xml:space="preserve">État</w:t>
+      </w:r>
+      <w:r>
+        <w:rPr>
+          <w:b w:val="false"/>
+          <w:bCs w:val="false"/>
+          <w:i w:val="false"/>
+          <w:iCs w:val="false"/>
+          <w:color w:val="000000"/>
+          <w:sz w:val="24"/>
+          <w:szCs w:val="24"/>
+          <w:rFonts w:ascii="Times New Roman" w:cs="Times New Roman" w:eastAsia="Times New Roman" w:hAnsi="Times New Roman"/>
+        </w:rPr>
+        <w:t xml:space="preserve"> au sens plein : lois écrites, ministères, armée de métier, diplomatie, écoles.</w:t>
+      </w:r>
+    </w:p>
+    <w:p>
+      <w:pPr>
+        <w:spacing w:after="100" w:line="300"/>
+        <w:jc w:val="both"/>
+      </w:pPr>
+      <w:r>
+        <w:rPr>
+          <w:b w:val="false"/>
+          <w:bCs w:val="false"/>
+          <w:i w:val="false"/>
+          <w:iCs w:val="false"/>
+          <w:color w:val="000000"/>
+          <w:sz w:val="24"/>
+          <w:szCs w:val="24"/>
+          <w:rFonts w:ascii="Times New Roman" w:cs="Times New Roman" w:eastAsia="Times New Roman" w:hAnsi="Times New Roman"/>
+        </w:rPr>
+        <w:t xml:space="preserve">Attention à la différence : LES </w:t>
+      </w:r>
+      <w:r>
+        <w:rPr>
+          <w:b/>
+          <w:bCs/>
+          <w:i w:val="false"/>
+          <w:iCs w:val="false"/>
+          <w:color w:val="1F4E79"/>
+          <w:sz w:val="24"/>
+          <w:szCs w:val="24"/>
+          <w:rFonts w:ascii="Times New Roman" w:cs="Times New Roman" w:eastAsia="Times New Roman" w:hAnsi="Times New Roman"/>
+        </w:rPr>
+        <w:t xml:space="preserve">royaumes malgaches</w:t>
+      </w:r>
+      <w:r>
+        <w:rPr>
+          <w:b w:val="false"/>
+          <w:bCs w:val="false"/>
+          <w:i w:val="false"/>
+          <w:iCs w:val="false"/>
+          <w:color w:val="000000"/>
+          <w:sz w:val="24"/>
+          <w:szCs w:val="24"/>
+          <w:rFonts w:ascii="Times New Roman" w:cs="Times New Roman" w:eastAsia="Times New Roman" w:hAnsi="Times New Roman"/>
+        </w:rPr>
+        <w:t xml:space="preserve"> (pluriel, régionaux, rivaux) et LE </w:t>
+      </w:r>
+      <w:r>
+        <w:rPr>
+          <w:b/>
+          <w:bCs/>
+          <w:i w:val="false"/>
+          <w:iCs w:val="false"/>
+          <w:color w:val="1F4E79"/>
+          <w:sz w:val="24"/>
+          <w:szCs w:val="24"/>
+          <w:rFonts w:ascii="Times New Roman" w:cs="Times New Roman" w:eastAsia="Times New Roman" w:hAnsi="Times New Roman"/>
+        </w:rPr>
+        <w:t xml:space="preserve">Royaume de Madagascar</w:t>
+      </w:r>
+      <w:r>
+        <w:rPr>
+          <w:b w:val="false"/>
+          <w:bCs w:val="false"/>
+          <w:i w:val="false"/>
+          <w:iCs w:val="false"/>
+          <w:color w:val="000000"/>
+          <w:sz w:val="24"/>
+          <w:szCs w:val="24"/>
+          <w:rFonts w:ascii="Times New Roman" w:cs="Times New Roman" w:eastAsia="Times New Roman" w:hAnsi="Times New Roman"/>
+        </w:rPr>
+        <w:t xml:space="preserve"> (singulier, englobant, reconnu). Cette marche vers l’unité, brisée en 1896 par la colonisation, a préparé la nation d’aujourd’hui.</w:t>
       </w:r>
     </w:p>
     <w:p>
@@ -2875,8 +3429,331 @@
     </w:p>
     <w:p>
       <w:pPr>
-        <w:spacing w:before="200" w:after="150"/>
-        <w:jc w:val="left"/>
+        <w:spacing w:after="120"/>
+      </w:pPr>
+    </w:p>
+    <w:tbl>
+      <w:tblPr>
+        <w:tblW w:type="dxa" w:w="9600"/>
+        <w:tblBorders>
+          <w:top w:val="single" w:color="B25000" w:sz="12"/>
+          <w:left w:val="single" w:color="B25000" w:sz="12"/>
+          <w:bottom w:val="single" w:color="B25000" w:sz="12"/>
+          <w:right w:val="single" w:color="B25000" w:sz="12"/>
+          <w:insideH w:val="none"/>
+          <w:insideV w:val="none"/>
+        </w:tblBorders>
+        <w:tblLayout w:type="fixed"/>
+      </w:tblPr>
+      <w:tblGrid>
+        <w:gridCol w:w="9600"/>
+      </w:tblGrid>
+      <w:tr>
+        <w:tc>
+          <w:tcPr>
+            <w:shd w:fill="FFF8EF" w:val="clear"/>
+            <w:tcMar>
+              <w:top w:type="dxa" w:w="140"/>
+              <w:left w:type="dxa" w:w="180"/>
+              <w:bottom w:type="dxa" w:w="140"/>
+              <w:right w:type="dxa" w:w="180"/>
+            </w:tcMar>
+          </w:tcPr>
+          <w:p>
+            <w:pPr>
+              <w:spacing w:after="90"/>
+            </w:pPr>
+            <w:r>
+              <w:rPr>
+                <w:b/>
+                <w:bCs/>
+                <w:i w:val="false"/>
+                <w:iCs w:val="false"/>
+                <w:color w:val="B25000"/>
+                <w:sz w:val="25"/>
+                <w:szCs w:val="25"/>
+                <w:rFonts w:ascii="Times New Roman" w:cs="Times New Roman" w:eastAsia="Times New Roman" w:hAnsi="Times New Roman"/>
+              </w:rPr>
+              <w:t xml:space="preserve">Document à étudier</w:t>
+            </w:r>
+          </w:p>
+          <w:p>
+            <w:pPr>
+              <w:spacing w:after="80" w:line="300"/>
+              <w:jc w:val="left"/>
+            </w:pPr>
+            <w:r>
+              <w:rPr>
+                <w:b/>
+                <w:bCs/>
+                <w:i w:val="false"/>
+                <w:iCs w:val="false"/>
+                <w:color w:val="000000"/>
+                <w:sz w:val="21"/>
+                <w:szCs w:val="21"/>
+                <w:rFonts w:ascii="Times New Roman" w:cs="Times New Roman" w:eastAsia="Times New Roman" w:hAnsi="Times New Roman"/>
+              </w:rPr>
+              <w:t xml:space="preserve">« La mer est la limite de ma rizière » — d’après le kabary d’Andrianampoinimerina rapporté dans le Tantara ny Andriana du R.P. Callet (1878) — extrait adapté</w:t>
+            </w:r>
+          </w:p>
+          <w:p>
+            <w:pPr>
+              <w:spacing w:after="100" w:line="300"/>
+              <w:jc w:val="both"/>
+            </w:pPr>
+            <w:r>
+              <w:rPr>
+                <w:b w:val="false"/>
+                <w:bCs w:val="false"/>
+                <w:i/>
+                <w:iCs/>
+                <w:color w:val="000000"/>
+                <w:sz w:val="24"/>
+                <w:szCs w:val="24"/>
+                <w:rFonts w:ascii="Times New Roman" w:cs="Times New Roman" w:eastAsia="Times New Roman" w:hAnsi="Times New Roman"/>
+              </w:rPr>
+              <w:t xml:space="preserve">« Andrianampoinimerina réunit le peuple et dit : « Voici ce que je vous déclare : l’Imerina est rassemblée sous mon autorité, mais ce n’est pas là le terme de mon dessein. Car ma rizière ne s’arrête pas aux collines que vous voyez : ny ranomasina no valam-parihiko — c’est la mer qui est la limite de ma rizière. Travaillez donc la terre, creusez les canaux, remplissez les greniers : un royaume fort est un royaume qui mange à sa faim. » »</w:t>
+            </w:r>
+          </w:p>
+          <w:p>
+            <w:pPr>
+              <w:spacing w:after="40" w:line="300"/>
+              <w:jc w:val="both"/>
+            </w:pPr>
+            <w:r>
+              <w:rPr>
+                <w:b w:val="false"/>
+                <w:bCs w:val="false"/>
+                <w:i w:val="false"/>
+                <w:iCs w:val="false"/>
+                <w:color w:val="000000"/>
+                <w:sz w:val="24"/>
+                <w:szCs w:val="24"/>
+                <w:rFonts w:ascii="Times New Roman" w:cs="Times New Roman" w:eastAsia="Times New Roman" w:hAnsi="Times New Roman"/>
+              </w:rPr>
+              <w:t xml:space="preserve">1. Que signifie la formule « ny ranomasina no valam-parihiko » ?</w:t>
+            </w:r>
+          </w:p>
+          <w:p>
+            <w:pPr>
+              <w:spacing w:after="40" w:line="300"/>
+              <w:jc w:val="both"/>
+            </w:pPr>
+            <w:r>
+              <w:rPr>
+                <w:b w:val="false"/>
+                <w:bCs w:val="false"/>
+                <w:i w:val="false"/>
+                <w:iCs w:val="false"/>
+                <w:color w:val="000000"/>
+                <w:sz w:val="24"/>
+                <w:szCs w:val="24"/>
+                <w:rFonts w:ascii="Times New Roman" w:cs="Times New Roman" w:eastAsia="Times New Roman" w:hAnsi="Times New Roman"/>
+              </w:rPr>
+              <w:t xml:space="preserve">2. Quel lien le roi établit-il entre l’agriculture et la puissance du royaume ?</w:t>
+            </w:r>
+          </w:p>
+          <w:p>
+            <w:pPr>
+              <w:spacing w:after="40" w:line="300"/>
+              <w:jc w:val="both"/>
+            </w:pPr>
+            <w:r>
+              <w:rPr>
+                <w:b w:val="false"/>
+                <w:bCs w:val="false"/>
+                <w:i w:val="false"/>
+                <w:iCs w:val="false"/>
+                <w:color w:val="000000"/>
+                <w:sz w:val="24"/>
+                <w:szCs w:val="24"/>
+                <w:rFonts w:ascii="Times New Roman" w:cs="Times New Roman" w:eastAsia="Times New Roman" w:hAnsi="Times New Roman"/>
+              </w:rPr>
+              <w:t xml:space="preserve">3. Qui réalisera en partie ce projet d’unification, et quelle étape politique cela ouvre-t-il ?</w:t>
+            </w:r>
+          </w:p>
+          <w:p>
+            <w:pPr>
+              <w:spacing w:after="60"/>
+            </w:pPr>
+          </w:p>
+          <w:p>
+            <w:pPr>
+              <w:spacing w:after="40"/>
+            </w:pPr>
+            <w:r>
+              <w:rPr>
+                <w:b/>
+                <w:bCs/>
+                <w:i w:val="false"/>
+                <w:iCs w:val="false"/>
+                <w:color w:val="C2185B"/>
+                <w:sz w:val="22"/>
+                <w:szCs w:val="22"/>
+                <w:rFonts w:ascii="Times New Roman" w:cs="Times New Roman" w:eastAsia="Times New Roman" w:hAnsi="Times New Roman"/>
+              </w:rPr>
+              <w:t xml:space="preserve">Réponse 1. </w:t>
+            </w:r>
+            <w:r>
+              <w:rPr>
+                <w:b w:val="false"/>
+                <w:bCs w:val="false"/>
+                <w:i w:val="false"/>
+                <w:iCs w:val="false"/>
+                <w:color w:val="000000"/>
+                <w:sz w:val="22"/>
+                <w:szCs w:val="22"/>
+                <w:rFonts w:ascii="Times New Roman" w:cs="Times New Roman" w:eastAsia="Times New Roman" w:hAnsi="Times New Roman"/>
+              </w:rPr>
+              <w:t xml:space="preserve">« La mer est la limite de ma rizière » : le roi annonce son projet d’étendre son autorité jusqu’aux côtes — unifier toute l’île.</w:t>
+            </w:r>
+          </w:p>
+          <w:p>
+            <w:pPr>
+              <w:spacing w:after="40"/>
+            </w:pPr>
+            <w:r>
+              <w:rPr>
+                <w:b/>
+                <w:bCs/>
+                <w:i w:val="false"/>
+                <w:iCs w:val="false"/>
+                <w:color w:val="C2185B"/>
+                <w:sz w:val="22"/>
+                <w:szCs w:val="22"/>
+                <w:rFonts w:ascii="Times New Roman" w:cs="Times New Roman" w:eastAsia="Times New Roman" w:hAnsi="Times New Roman"/>
+              </w:rPr>
+              <w:t xml:space="preserve">Réponse 2. </w:t>
+            </w:r>
+            <w:r>
+              <w:rPr>
+                <w:b w:val="false"/>
+                <w:bCs w:val="false"/>
+                <w:i w:val="false"/>
+                <w:iCs w:val="false"/>
+                <w:color w:val="000000"/>
+                <w:sz w:val="22"/>
+                <w:szCs w:val="22"/>
+                <w:rFonts w:ascii="Times New Roman" w:cs="Times New Roman" w:eastAsia="Times New Roman" w:hAnsi="Times New Roman"/>
+              </w:rPr>
+              <w:t xml:space="preserve">Un royaume fort est un royaume qui mange à sa faim : digues, canaux et greniers pleins sont la base de la puissance politique.</w:t>
+            </w:r>
+          </w:p>
+          <w:p>
+            <w:pPr>
+              <w:spacing w:after="40"/>
+            </w:pPr>
+            <w:r>
+              <w:rPr>
+                <w:b/>
+                <w:bCs/>
+                <w:i w:val="false"/>
+                <w:iCs w:val="false"/>
+                <w:color w:val="C2185B"/>
+                <w:sz w:val="22"/>
+                <w:szCs w:val="22"/>
+                <w:rFonts w:ascii="Times New Roman" w:cs="Times New Roman" w:eastAsia="Times New Roman" w:hAnsi="Times New Roman"/>
+              </w:rPr>
+              <w:t xml:space="preserve">Réponse 3. </w:t>
+            </w:r>
+            <w:r>
+              <w:rPr>
+                <w:b w:val="false"/>
+                <w:bCs w:val="false"/>
+                <w:i w:val="false"/>
+                <w:iCs w:val="false"/>
+                <w:color w:val="000000"/>
+                <w:sz w:val="22"/>
+                <w:szCs w:val="22"/>
+                <w:rFonts w:ascii="Times New Roman" w:cs="Times New Roman" w:eastAsia="Times New Roman" w:hAnsi="Times New Roman"/>
+              </w:rPr>
+              <w:t xml:space="preserve">Son fils Radama Iᵉʳ, à partir de 1810 : c’est la quatrième marche, le Royaume de Madagascar, État unifié et reconnu par les traités.</w:t>
+            </w:r>
+          </w:p>
+        </w:tc>
+      </w:tr>
+    </w:tbl>
+    <w:p>
+      <w:pPr>
+        <w:spacing w:after="160"/>
+      </w:pPr>
+    </w:p>
+    <w:tbl>
+      <w:tblPr>
+        <w:tblW w:type="dxa" w:w="9600"/>
+        <w:tblBorders>
+          <w:top w:val="single" w:color="1565C0" w:sz="12"/>
+          <w:left w:val="single" w:color="1565C0" w:sz="12"/>
+          <w:bottom w:val="single" w:color="1565C0" w:sz="12"/>
+          <w:right w:val="single" w:color="1565C0" w:sz="12"/>
+          <w:insideH w:val="none"/>
+          <w:insideV w:val="none"/>
+        </w:tblBorders>
+        <w:tblLayout w:type="fixed"/>
+      </w:tblPr>
+      <w:tblGrid>
+        <w:gridCol w:w="9600"/>
+      </w:tblGrid>
+      <w:tr>
+        <w:tc>
+          <w:tcPr>
+            <w:shd w:fill="E3F2FD" w:val="clear"/>
+            <w:tcMar>
+              <w:top w:type="dxa" w:w="140"/>
+              <w:left w:type="dxa" w:w="180"/>
+              <w:bottom w:type="dxa" w:w="140"/>
+              <w:right w:type="dxa" w:w="180"/>
+            </w:tcMar>
+          </w:tcPr>
+          <w:p>
+            <w:pPr>
+              <w:spacing w:after="90"/>
+            </w:pPr>
+            <w:r>
+              <w:rPr>
+                <w:b/>
+                <w:bCs/>
+                <w:i w:val="false"/>
+                <w:iCs w:val="false"/>
+                <w:color w:val="1565C0"/>
+                <w:sz w:val="25"/>
+                <w:szCs w:val="25"/>
+                <w:rFonts w:ascii="Times New Roman" w:cs="Times New Roman" w:eastAsia="Times New Roman" w:hAnsi="Times New Roman"/>
+              </w:rPr>
+              <w:t xml:space="preserve">Le savais-tu ?</w:t>
+            </w:r>
+          </w:p>
+          <w:p>
+            <w:pPr>
+              <w:spacing w:after="0" w:line="300"/>
+              <w:jc w:val="both"/>
+            </w:pPr>
+            <w:r>
+              <w:rPr>
+                <w:b w:val="false"/>
+                <w:bCs w:val="false"/>
+                <w:i w:val="false"/>
+                <w:iCs w:val="false"/>
+                <w:color w:val="000000"/>
+                <w:sz w:val="22"/>
+                <w:szCs w:val="22"/>
+                <w:rFonts w:ascii="Times New Roman" w:cs="Times New Roman" w:eastAsia="Times New Roman" w:hAnsi="Times New Roman"/>
+              </w:rPr>
+              <w:t xml:space="preserve">Andrianampoinimerina gouvernait depuis Ambohimanga par de célèbres kabary : il réunissait le peuple et déclarait « Ny ranomasina no valam-parihiko » — « la mer est la limite de ma rizière » ! Son fils Radama Iᵉʳ réalisa en partie ce rêve : à sa mort en 1828, son autorité couvrait la majeure partie de l’île, et les puissances étrangères signaient des traités avec « le roi de Madagascar ».</w:t>
+            </w:r>
+          </w:p>
+        </w:tc>
+      </w:tr>
+    </w:tbl>
+    <w:p>
+      <w:pPr>
+        <w:spacing w:after="160"/>
+      </w:pPr>
+    </w:p>
+    <w:p>
+      <w:pPr>
+        <w:spacing w:after="80" w:line="300"/>
+        <w:jc w:val="both"/>
       </w:pPr>
       <w:r>
         <w:rPr>
@@ -2885,166 +3762,337 @@
           <w:i w:val="false"/>
           <w:iCs w:val="false"/>
           <w:color w:val="2E7D32"/>
-          <w:sz w:val="28"/>
-          <w:szCs w:val="28"/>
-          <w:rFonts w:ascii="Times New Roman" w:cs="Times New Roman" w:eastAsia="Times New Roman" w:hAnsi="Times New Roman"/>
-        </w:rPr>
-        <w:t xml:space="preserve">Méthode</w:t>
-      </w:r>
-    </w:p>
-    <w:p>
-      <w:pPr>
-        <w:spacing w:after="60" w:line="300"/>
-        <w:jc w:val="both"/>
-      </w:pPr>
-      <w:r>
-        <w:rPr>
-          <w:b w:val="false"/>
-          <w:bCs w:val="false"/>
-          <w:i w:val="false"/>
-          <w:iCs w:val="false"/>
-          <w:color w:val="000000"/>
-          <w:sz w:val="24"/>
-          <w:szCs w:val="24"/>
-          <w:rFonts w:ascii="Times New Roman" w:cs="Times New Roman" w:eastAsia="Times New Roman" w:hAnsi="Times New Roman"/>
-        </w:rPr>
-        <w:t xml:space="preserve">1. Ranger les quatre étapes sur la frise avec leurs dates.</w:t>
-      </w:r>
-    </w:p>
-    <w:p>
-      <w:pPr>
-        <w:spacing w:after="60" w:line="300"/>
-        <w:jc w:val="both"/>
-      </w:pPr>
-      <w:r>
-        <w:rPr>
-          <w:b w:val="false"/>
-          <w:bCs w:val="false"/>
-          <w:i w:val="false"/>
-          <w:iCs w:val="false"/>
-          <w:color w:val="000000"/>
-          <w:sz w:val="24"/>
-          <w:szCs w:val="24"/>
-          <w:rFonts w:ascii="Times New Roman" w:cs="Times New Roman" w:eastAsia="Times New Roman" w:hAnsi="Times New Roman"/>
-        </w:rPr>
-        <w:t xml:space="preserve">2. Pour chaque étape : qui dirige, sur quel territoire, avec quelles institutions ?</w:t>
-      </w:r>
-    </w:p>
-    <w:p>
-      <w:pPr>
-        <w:spacing w:after="60" w:line="300"/>
-        <w:jc w:val="both"/>
-      </w:pPr>
-      <w:r>
-        <w:rPr>
-          <w:b w:val="false"/>
-          <w:bCs w:val="false"/>
-          <w:i w:val="false"/>
-          <w:iCs w:val="false"/>
-          <w:color w:val="000000"/>
-          <w:sz w:val="24"/>
-          <w:szCs w:val="24"/>
-          <w:rFonts w:ascii="Times New Roman" w:cs="Times New Roman" w:eastAsia="Times New Roman" w:hAnsi="Times New Roman"/>
-        </w:rPr>
-        <w:t xml:space="preserve">3. Distinguer les royaumes malgaches (pluriel) du Royaume de Madagascar (singulier).</w:t>
-      </w:r>
-    </w:p>
-    <w:p>
-      <w:pPr>
-        <w:spacing w:after="110" w:line="300"/>
-        <w:jc w:val="both"/>
-      </w:pPr>
-      <w:r>
-        <w:rPr>
-          <w:b/>
-          <w:bCs/>
-          <w:i w:val="false"/>
-          <w:iCs w:val="false"/>
-          <w:color w:val="1F4E79"/>
-          <w:sz w:val="24"/>
-          <w:szCs w:val="24"/>
-          <w:rFonts w:ascii="Times New Roman" w:cs="Times New Roman" w:eastAsia="Times New Roman" w:hAnsi="Times New Roman"/>
-        </w:rPr>
-        <w:t xml:space="preserve">Exemple — </w:t>
-      </w:r>
-      <w:r>
-        <w:rPr>
-          <w:b w:val="false"/>
-          <w:bCs w:val="false"/>
-          <w:i w:val="false"/>
-          <w:iCs w:val="false"/>
-          <w:color w:val="000000"/>
-          <w:sz w:val="24"/>
-          <w:szCs w:val="24"/>
-          <w:rFonts w:ascii="Times New Roman" w:cs="Times New Roman" w:eastAsia="Times New Roman" w:hAnsi="Times New Roman"/>
-        </w:rPr>
-        <w:t xml:space="preserve">Ratsimilaho unifie les clans de la côte Est vers 1712 : on passe de clans dispersés à un royaume betsimisaraka — l’exemple parfait de la troisième marche. Un siècle plus tard, Radama Iᵉʳ franchit la quatrième.</w:t>
-      </w:r>
-    </w:p>
-    <w:p>
-      <w:pPr>
-        <w:spacing w:after="110" w:line="300"/>
-        <w:jc w:val="both"/>
-      </w:pPr>
-      <w:r>
-        <w:rPr>
-          <w:b/>
-          <w:bCs/>
-          <w:i w:val="false"/>
-          <w:iCs w:val="false"/>
-          <w:color w:val="B25000"/>
-          <w:sz w:val="24"/>
-          <w:szCs w:val="24"/>
-          <w:rFonts w:ascii="Times New Roman" w:cs="Times New Roman" w:eastAsia="Times New Roman" w:hAnsi="Times New Roman"/>
-        </w:rPr>
-        <w:t xml:space="preserve">Erreur à éviter — </w:t>
-      </w:r>
-      <w:r>
-        <w:rPr>
-          <w:b w:val="false"/>
-          <w:bCs w:val="false"/>
-          <w:i w:val="false"/>
-          <w:iCs w:val="false"/>
-          <w:color w:val="000000"/>
-          <w:sz w:val="24"/>
-          <w:szCs w:val="24"/>
-          <w:rFonts w:ascii="Times New Roman" w:cs="Times New Roman" w:eastAsia="Times New Roman" w:hAnsi="Times New Roman"/>
-        </w:rPr>
-        <w:t xml:space="preserve">Croire que le Royaume de Madagascar a existé « de tout temps » : il naît en 1810 d’une longue évolution — avant lui, l’île connaissait des royaumes rivaux, et avant eux des clans. L’unité politique est une construction historique, pas un état naturel.</w:t>
-      </w:r>
-    </w:p>
-    <w:p>
-      <w:pPr>
-        <w:shd w:fill="E3F2FD" w:val="clear"/>
-        <w:spacing w:after="110" w:line="300"/>
-        <w:jc w:val="both"/>
-      </w:pPr>
-      <w:r>
-        <w:rPr>
-          <w:b/>
-          <w:bCs/>
-          <w:i w:val="false"/>
-          <w:iCs w:val="false"/>
-          <w:color w:val="1565C0"/>
-          <w:sz w:val="24"/>
-          <w:szCs w:val="24"/>
-          <w:rFonts w:ascii="Times New Roman" w:cs="Times New Roman" w:eastAsia="Times New Roman" w:hAnsi="Times New Roman"/>
-        </w:rPr>
-        <w:t xml:space="preserve">Le savais-tu ? </w:t>
-      </w:r>
-      <w:r>
-        <w:rPr>
-          <w:b w:val="false"/>
-          <w:bCs w:val="false"/>
-          <w:i w:val="false"/>
-          <w:iCs w:val="false"/>
-          <w:color w:val="000000"/>
-          <w:sz w:val="24"/>
-          <w:szCs w:val="24"/>
-          <w:rFonts w:ascii="Times New Roman" w:cs="Times New Roman" w:eastAsia="Times New Roman" w:hAnsi="Times New Roman"/>
-        </w:rPr>
-        <w:t xml:space="preserve">Andrianampoinimerina gouvernait depuis Ambohimanga par de célèbres kabary : il réunissait le peuple et déclarait « Ny ranomasina no valam-parihiko » — « la mer est la limite de ma rizière » ! Son fils Radama Iᵉʳ réalisa en partie ce rêve : à sa mort en 1828, son autorité couvrait la majeure partie de l’île, et les puissances étrangères signaient des traités avec « le roi de Madagascar ».</w:t>
-      </w:r>
+          <w:sz w:val="26"/>
+          <w:szCs w:val="26"/>
+          <w:rFonts w:ascii="Times New Roman" w:cs="Times New Roman" w:eastAsia="Times New Roman" w:hAnsi="Times New Roman"/>
+        </w:rPr>
+        <w:t xml:space="preserve">Petit lexique</w:t>
+      </w:r>
+    </w:p>
+    <w:tbl>
+      <w:tblPr>
+        <w:tblW w:type="dxa" w:w="9600"/>
+        <w:tblBorders>
+          <w:top w:val="single" w:color="808080" w:sz="4"/>
+          <w:left w:val="single" w:color="808080" w:sz="4"/>
+          <w:bottom w:val="single" w:color="808080" w:sz="4"/>
+          <w:right w:val="single" w:color="808080" w:sz="4"/>
+          <w:insideH w:val="single" w:color="B0B0B0" w:sz="4"/>
+          <w:insideV w:val="single" w:color="B0B0B0" w:sz="4"/>
+        </w:tblBorders>
+        <w:tblLayout w:type="fixed"/>
+      </w:tblPr>
+      <w:tblGrid>
+        <w:gridCol w:w="2800"/>
+        <w:gridCol w:w="6800"/>
+      </w:tblGrid>
+      <w:tr>
+        <w:tc>
+          <w:tcPr>
+            <w:shd w:fill="E7E6E6" w:val="clear"/>
+            <w:tcMar>
+              <w:top w:type="dxa" w:w="80"/>
+              <w:left w:type="dxa" w:w="80"/>
+              <w:bottom w:type="dxa" w:w="80"/>
+              <w:right w:type="dxa" w:w="80"/>
+            </w:tcMar>
+          </w:tcPr>
+          <w:p>
+            <w:pPr>
+              <w:spacing w:after="40"/>
+              <w:jc w:val="left"/>
+            </w:pPr>
+            <w:r>
+              <w:rPr>
+                <w:b/>
+                <w:bCs/>
+                <w:i w:val="false"/>
+                <w:iCs w:val="false"/>
+                <w:color w:val="000000"/>
+                <w:sz w:val="20"/>
+                <w:szCs w:val="20"/>
+                <w:rFonts w:ascii="Times New Roman" w:cs="Times New Roman" w:eastAsia="Times New Roman" w:hAnsi="Times New Roman"/>
+              </w:rPr>
+              <w:t xml:space="preserve">Mot</w:t>
+            </w:r>
+          </w:p>
+        </w:tc>
+        <w:tc>
+          <w:tcPr>
+            <w:shd w:fill="E7E6E6" w:val="clear"/>
+            <w:tcMar>
+              <w:top w:type="dxa" w:w="80"/>
+              <w:left w:type="dxa" w:w="80"/>
+              <w:bottom w:type="dxa" w:w="80"/>
+              <w:right w:type="dxa" w:w="80"/>
+            </w:tcMar>
+          </w:tcPr>
+          <w:p>
+            <w:pPr>
+              <w:spacing w:after="40"/>
+              <w:jc w:val="left"/>
+            </w:pPr>
+            <w:r>
+              <w:rPr>
+                <w:b/>
+                <w:bCs/>
+                <w:i w:val="false"/>
+                <w:iCs w:val="false"/>
+                <w:color w:val="000000"/>
+                <w:sz w:val="20"/>
+                <w:szCs w:val="20"/>
+                <w:rFonts w:ascii="Times New Roman" w:cs="Times New Roman" w:eastAsia="Times New Roman" w:hAnsi="Times New Roman"/>
+              </w:rPr>
+              <w:t xml:space="preserve">Sens</w:t>
+            </w:r>
+          </w:p>
+        </w:tc>
+      </w:tr>
+      <w:tr>
+        <w:tc>
+          <w:tcPr>
+            <w:tcMar>
+              <w:top w:type="dxa" w:w="80"/>
+              <w:left w:type="dxa" w:w="80"/>
+              <w:bottom w:type="dxa" w:w="80"/>
+              <w:right w:type="dxa" w:w="80"/>
+            </w:tcMar>
+          </w:tcPr>
+          <w:p>
+            <w:pPr>
+              <w:spacing w:after="40"/>
+              <w:jc w:val="left"/>
+            </w:pPr>
+            <w:r>
+              <w:rPr>
+                <w:b/>
+                <w:bCs/>
+                <w:i w:val="false"/>
+                <w:iCs w:val="false"/>
+                <w:color w:val="000000"/>
+                <w:sz w:val="20"/>
+                <w:szCs w:val="20"/>
+                <w:rFonts w:ascii="Times New Roman" w:cs="Times New Roman" w:eastAsia="Times New Roman" w:hAnsi="Times New Roman"/>
+              </w:rPr>
+              <w:t xml:space="preserve">Clan</w:t>
+            </w:r>
+          </w:p>
+        </w:tc>
+        <w:tc>
+          <w:tcPr>
+            <w:tcMar>
+              <w:top w:type="dxa" w:w="80"/>
+              <w:left w:type="dxa" w:w="80"/>
+              <w:bottom w:type="dxa" w:w="80"/>
+              <w:right w:type="dxa" w:w="80"/>
+            </w:tcMar>
+          </w:tcPr>
+          <w:p>
+            <w:pPr>
+              <w:spacing w:after="40"/>
+              <w:jc w:val="left"/>
+            </w:pPr>
+            <w:r>
+              <w:rPr>
+                <w:b w:val="false"/>
+                <w:bCs w:val="false"/>
+                <w:i w:val="false"/>
+                <w:iCs w:val="false"/>
+                <w:color w:val="000000"/>
+                <w:sz w:val="20"/>
+                <w:szCs w:val="20"/>
+                <w:rFonts w:ascii="Times New Roman" w:cs="Times New Roman" w:eastAsia="Times New Roman" w:hAnsi="Times New Roman"/>
+              </w:rPr>
+              <w:t xml:space="preserve">groupe de familles descendant d’un ancêtre commun</w:t>
+            </w:r>
+          </w:p>
+        </w:tc>
+      </w:tr>
+      <w:tr>
+        <w:tc>
+          <w:tcPr>
+            <w:tcMar>
+              <w:top w:type="dxa" w:w="80"/>
+              <w:left w:type="dxa" w:w="80"/>
+              <w:bottom w:type="dxa" w:w="80"/>
+              <w:right w:type="dxa" w:w="80"/>
+            </w:tcMar>
+          </w:tcPr>
+          <w:p>
+            <w:pPr>
+              <w:spacing w:after="40"/>
+              <w:jc w:val="left"/>
+            </w:pPr>
+            <w:r>
+              <w:rPr>
+                <w:b/>
+                <w:bCs/>
+                <w:i w:val="false"/>
+                <w:iCs w:val="false"/>
+                <w:color w:val="000000"/>
+                <w:sz w:val="20"/>
+                <w:szCs w:val="20"/>
+                <w:rFonts w:ascii="Times New Roman" w:cs="Times New Roman" w:eastAsia="Times New Roman" w:hAnsi="Times New Roman"/>
+              </w:rPr>
+              <w:t xml:space="preserve">Roitelet</w:t>
+            </w:r>
+          </w:p>
+        </w:tc>
+        <w:tc>
+          <w:tcPr>
+            <w:tcMar>
+              <w:top w:type="dxa" w:w="80"/>
+              <w:left w:type="dxa" w:w="80"/>
+              <w:bottom w:type="dxa" w:w="80"/>
+              <w:right w:type="dxa" w:w="80"/>
+            </w:tcMar>
+          </w:tcPr>
+          <w:p>
+            <w:pPr>
+              <w:spacing w:after="40"/>
+              <w:jc w:val="left"/>
+            </w:pPr>
+            <w:r>
+              <w:rPr>
+                <w:b w:val="false"/>
+                <w:bCs w:val="false"/>
+                <w:i w:val="false"/>
+                <w:iCs w:val="false"/>
+                <w:color w:val="000000"/>
+                <w:sz w:val="20"/>
+                <w:szCs w:val="20"/>
+                <w:rFonts w:ascii="Times New Roman" w:cs="Times New Roman" w:eastAsia="Times New Roman" w:hAnsi="Times New Roman"/>
+              </w:rPr>
+              <w:t xml:space="preserve">chef reconnu par plusieurs clans confédérés</w:t>
+            </w:r>
+          </w:p>
+        </w:tc>
+      </w:tr>
+      <w:tr>
+        <w:tc>
+          <w:tcPr>
+            <w:tcMar>
+              <w:top w:type="dxa" w:w="80"/>
+              <w:left w:type="dxa" w:w="80"/>
+              <w:bottom w:type="dxa" w:w="80"/>
+              <w:right w:type="dxa" w:w="80"/>
+            </w:tcMar>
+          </w:tcPr>
+          <w:p>
+            <w:pPr>
+              <w:spacing w:after="40"/>
+              <w:jc w:val="left"/>
+            </w:pPr>
+            <w:r>
+              <w:rPr>
+                <w:b/>
+                <w:bCs/>
+                <w:i w:val="false"/>
+                <w:iCs w:val="false"/>
+                <w:color w:val="000000"/>
+                <w:sz w:val="20"/>
+                <w:szCs w:val="20"/>
+                <w:rFonts w:ascii="Times New Roman" w:cs="Times New Roman" w:eastAsia="Times New Roman" w:hAnsi="Times New Roman"/>
+              </w:rPr>
+              <w:t xml:space="preserve">Kabary</w:t>
+            </w:r>
+          </w:p>
+        </w:tc>
+        <w:tc>
+          <w:tcPr>
+            <w:tcMar>
+              <w:top w:type="dxa" w:w="80"/>
+              <w:left w:type="dxa" w:w="80"/>
+              <w:bottom w:type="dxa" w:w="80"/>
+              <w:right w:type="dxa" w:w="80"/>
+            </w:tcMar>
+          </w:tcPr>
+          <w:p>
+            <w:pPr>
+              <w:spacing w:after="40"/>
+              <w:jc w:val="left"/>
+            </w:pPr>
+            <w:r>
+              <w:rPr>
+                <w:b w:val="false"/>
+                <w:bCs w:val="false"/>
+                <w:i w:val="false"/>
+                <w:iCs w:val="false"/>
+                <w:color w:val="000000"/>
+                <w:sz w:val="20"/>
+                <w:szCs w:val="20"/>
+                <w:rFonts w:ascii="Times New Roman" w:cs="Times New Roman" w:eastAsia="Times New Roman" w:hAnsi="Times New Roman"/>
+              </w:rPr>
+              <w:t xml:space="preserve">grand discours public du souverain au peuple</w:t>
+            </w:r>
+          </w:p>
+        </w:tc>
+      </w:tr>
+      <w:tr>
+        <w:tc>
+          <w:tcPr>
+            <w:tcMar>
+              <w:top w:type="dxa" w:w="80"/>
+              <w:left w:type="dxa" w:w="80"/>
+              <w:bottom w:type="dxa" w:w="80"/>
+              <w:right w:type="dxa" w:w="80"/>
+            </w:tcMar>
+          </w:tcPr>
+          <w:p>
+            <w:pPr>
+              <w:spacing w:after="40"/>
+              <w:jc w:val="left"/>
+            </w:pPr>
+            <w:r>
+              <w:rPr>
+                <w:b/>
+                <w:bCs/>
+                <w:i w:val="false"/>
+                <w:iCs w:val="false"/>
+                <w:color w:val="000000"/>
+                <w:sz w:val="20"/>
+                <w:szCs w:val="20"/>
+                <w:rFonts w:ascii="Times New Roman" w:cs="Times New Roman" w:eastAsia="Times New Roman" w:hAnsi="Times New Roman"/>
+              </w:rPr>
+              <w:t xml:space="preserve">État</w:t>
+            </w:r>
+          </w:p>
+        </w:tc>
+        <w:tc>
+          <w:tcPr>
+            <w:tcMar>
+              <w:top w:type="dxa" w:w="80"/>
+              <w:left w:type="dxa" w:w="80"/>
+              <w:bottom w:type="dxa" w:w="80"/>
+              <w:right w:type="dxa" w:w="80"/>
+            </w:tcMar>
+          </w:tcPr>
+          <w:p>
+            <w:pPr>
+              <w:spacing w:after="40"/>
+              <w:jc w:val="left"/>
+            </w:pPr>
+            <w:r>
+              <w:rPr>
+                <w:b w:val="false"/>
+                <w:bCs w:val="false"/>
+                <w:i w:val="false"/>
+                <w:iCs w:val="false"/>
+                <w:color w:val="000000"/>
+                <w:sz w:val="20"/>
+                <w:szCs w:val="20"/>
+                <w:rFonts w:ascii="Times New Roman" w:cs="Times New Roman" w:eastAsia="Times New Roman" w:hAnsi="Times New Roman"/>
+              </w:rPr>
+              <w:t xml:space="preserve">pouvoir organisé : lois, institutions, armée, diplomatie</w:t>
+            </w:r>
+          </w:p>
+        </w:tc>
+      </w:tr>
+    </w:tbl>
+    <w:p>
+      <w:pPr>
+        <w:spacing w:after="120"/>
+      </w:pPr>
     </w:p>
     <w:p>
       <w:pPr>
@@ -4708,152 +5756,152 @@
                 <w:szCs w:val="20"/>
                 <w:rFonts w:ascii="Times New Roman" w:cs="Times New Roman" w:eastAsia="Times New Roman" w:hAnsi="Times New Roman"/>
               </w:rPr>
-              <w:t xml:space="preserve">3. Observation</w:t>
-            </w:r>
-          </w:p>
-        </w:tc>
-        <w:tc>
-          <w:tcPr>
-            <w:tcMar>
-              <w:top w:type="dxa" w:w="80"/>
-              <w:left w:type="dxa" w:w="80"/>
-              <w:bottom w:type="dxa" w:w="80"/>
-              <w:right w:type="dxa" w:w="80"/>
-            </w:tcMar>
-          </w:tcPr>
-          <w:p>
-            <w:pPr>
-              <w:spacing w:after="40"/>
-              <w:jc w:val="left"/>
-            </w:pPr>
-            <w:r>
-              <w:rPr>
-                <w:b w:val="false"/>
-                <w:bCs w:val="false"/>
-                <w:i w:val="false"/>
-                <w:iCs w:val="false"/>
-                <w:color w:val="000000"/>
-                <w:sz w:val="20"/>
-                <w:szCs w:val="20"/>
-                <w:rFonts w:ascii="Times New Roman" w:cs="Times New Roman" w:eastAsia="Times New Roman" w:hAnsi="Times New Roman"/>
-              </w:rPr>
-              <w:t xml:space="preserve">Un journaliste écrit « l’ethnie vezo » ; l’élève historien corrige : les Vezo parlent malgache et partagent la culture commune — ce sont un groupe de population défini par la vie en mer, non une ethnie.</w:t>
-            </w:r>
-          </w:p>
-        </w:tc>
-        <w:tc>
-          <w:tcPr>
-            <w:tcMar>
-              <w:top w:type="dxa" w:w="80"/>
-              <w:left w:type="dxa" w:w="80"/>
-              <w:bottom w:type="dxa" w:w="80"/>
-              <w:right w:type="dxa" w:w="80"/>
-            </w:tcMar>
-          </w:tcPr>
-          <w:p>
-            <w:pPr>
-              <w:spacing w:after="40"/>
-              <w:jc w:val="left"/>
-            </w:pPr>
-            <w:r>
-              <w:rPr>
-                <w:b w:val="false"/>
-                <w:bCs w:val="false"/>
-                <w:i w:val="false"/>
-                <w:iCs w:val="false"/>
-                <w:color w:val="000000"/>
-                <w:sz w:val="20"/>
-                <w:szCs w:val="20"/>
-                <w:rFonts w:ascii="Times New Roman" w:cs="Times New Roman" w:eastAsia="Times New Roman" w:hAnsi="Times New Roman"/>
-              </w:rPr>
-              <w:t xml:space="preserve">Observent l’exemple résolu.</w:t>
-            </w:r>
-          </w:p>
-        </w:tc>
-        <w:tc>
-          <w:tcPr>
-            <w:tcMar>
-              <w:top w:type="dxa" w:w="80"/>
-              <w:left w:type="dxa" w:w="80"/>
-              <w:bottom w:type="dxa" w:w="80"/>
-              <w:right w:type="dxa" w:w="80"/>
-            </w:tcMar>
-          </w:tcPr>
-          <w:p>
-            <w:pPr>
-              <w:spacing w:after="40"/>
-              <w:jc w:val="left"/>
-            </w:pPr>
-            <w:r>
-              <w:rPr>
-                <w:b w:val="false"/>
-                <w:bCs w:val="false"/>
-                <w:i w:val="false"/>
-                <w:iCs w:val="false"/>
-                <w:color w:val="000000"/>
-                <w:sz w:val="20"/>
-                <w:szCs w:val="20"/>
-                <w:rFonts w:ascii="Times New Roman" w:cs="Times New Roman" w:eastAsia="Times New Roman" w:hAnsi="Times New Roman"/>
-              </w:rPr>
-              <w:t xml:space="preserve">Observation dirigée</w:t>
-            </w:r>
-          </w:p>
-        </w:tc>
-        <w:tc>
-          <w:tcPr>
-            <w:tcMar>
-              <w:top w:type="dxa" w:w="80"/>
-              <w:left w:type="dxa" w:w="80"/>
-              <w:bottom w:type="dxa" w:w="80"/>
-              <w:right w:type="dxa" w:w="80"/>
-            </w:tcMar>
-          </w:tcPr>
-          <w:p>
-            <w:pPr>
-              <w:spacing w:after="40"/>
-              <w:jc w:val="left"/>
-            </w:pPr>
-            <w:r>
-              <w:rPr>
-                <w:b w:val="false"/>
-                <w:bCs w:val="false"/>
-                <w:i w:val="false"/>
-                <w:iCs w:val="false"/>
-                <w:color w:val="000000"/>
-                <w:sz w:val="20"/>
-                <w:szCs w:val="20"/>
-                <w:rFonts w:ascii="Times New Roman" w:cs="Times New Roman" w:eastAsia="Times New Roman" w:hAnsi="Times New Roman"/>
-              </w:rPr>
-              <w:t xml:space="preserve">Document imprimé</w:t>
-            </w:r>
-          </w:p>
-        </w:tc>
-        <w:tc>
-          <w:tcPr>
-            <w:tcMar>
-              <w:top w:type="dxa" w:w="80"/>
-              <w:left w:type="dxa" w:w="80"/>
-              <w:bottom w:type="dxa" w:w="80"/>
-              <w:right w:type="dxa" w:w="80"/>
-            </w:tcMar>
-          </w:tcPr>
-          <w:p>
-            <w:pPr>
-              <w:spacing w:after="40"/>
-              <w:jc w:val="left"/>
-            </w:pPr>
-            <w:r>
-              <w:rPr>
-                <w:b w:val="false"/>
-                <w:bCs w:val="false"/>
-                <w:i w:val="false"/>
-                <w:iCs w:val="false"/>
-                <w:color w:val="000000"/>
-                <w:sz w:val="20"/>
-                <w:szCs w:val="20"/>
-                <w:rFonts w:ascii="Times New Roman" w:cs="Times New Roman" w:eastAsia="Times New Roman" w:hAnsi="Times New Roman"/>
-              </w:rPr>
-              <w:t xml:space="preserve">Compréhension</w:t>
+              <w:t xml:space="preserve">3. Développement</w:t>
+            </w:r>
+          </w:p>
+        </w:tc>
+        <w:tc>
+          <w:tcPr>
+            <w:tcMar>
+              <w:top w:type="dxa" w:w="80"/>
+              <w:left w:type="dxa" w:w="80"/>
+              <w:bottom w:type="dxa" w:w="80"/>
+              <w:right w:type="dxa" w:w="80"/>
+            </w:tcMar>
+          </w:tcPr>
+          <w:p>
+            <w:pPr>
+              <w:spacing w:after="40"/>
+              <w:jc w:val="left"/>
+            </w:pPr>
+            <w:r>
+              <w:rPr>
+                <w:b w:val="false"/>
+                <w:bCs w:val="false"/>
+                <w:i w:val="false"/>
+                <w:iCs w:val="false"/>
+                <w:color w:val="000000"/>
+                <w:sz w:val="20"/>
+                <w:szCs w:val="20"/>
+                <w:rFonts w:ascii="Times New Roman" w:cs="Times New Roman" w:eastAsia="Times New Roman" w:hAnsi="Times New Roman"/>
+              </w:rPr>
+              <w:t xml:space="preserve">Développe la leçon partie par partie : Trois concepts, trois définitions ; Le double test appliqué à Madagascar ; Les mots font l’histoire.</w:t>
+            </w:r>
+          </w:p>
+        </w:tc>
+        <w:tc>
+          <w:tcPr>
+            <w:tcMar>
+              <w:top w:type="dxa" w:w="80"/>
+              <w:left w:type="dxa" w:w="80"/>
+              <w:bottom w:type="dxa" w:w="80"/>
+              <w:right w:type="dxa" w:w="80"/>
+            </w:tcMar>
+          </w:tcPr>
+          <w:p>
+            <w:pPr>
+              <w:spacing w:after="40"/>
+              <w:jc w:val="left"/>
+            </w:pPr>
+            <w:r>
+              <w:rPr>
+                <w:b w:val="false"/>
+                <w:bCs w:val="false"/>
+                <w:i w:val="false"/>
+                <w:iCs w:val="false"/>
+                <w:color w:val="000000"/>
+                <w:sz w:val="20"/>
+                <w:szCs w:val="20"/>
+                <w:rFonts w:ascii="Times New Roman" w:cs="Times New Roman" w:eastAsia="Times New Roman" w:hAnsi="Times New Roman"/>
+              </w:rPr>
+              <w:t xml:space="preserve">Écoutent, répondent aux questions et notent les mots-clés.</w:t>
+            </w:r>
+          </w:p>
+        </w:tc>
+        <w:tc>
+          <w:tcPr>
+            <w:tcMar>
+              <w:top w:type="dxa" w:w="80"/>
+              <w:left w:type="dxa" w:w="80"/>
+              <w:bottom w:type="dxa" w:w="80"/>
+              <w:right w:type="dxa" w:w="80"/>
+            </w:tcMar>
+          </w:tcPr>
+          <w:p>
+            <w:pPr>
+              <w:spacing w:after="40"/>
+              <w:jc w:val="left"/>
+            </w:pPr>
+            <w:r>
+              <w:rPr>
+                <w:b w:val="false"/>
+                <w:bCs w:val="false"/>
+                <w:i w:val="false"/>
+                <w:iCs w:val="false"/>
+                <w:color w:val="000000"/>
+                <w:sz w:val="20"/>
+                <w:szCs w:val="20"/>
+                <w:rFonts w:ascii="Times New Roman" w:cs="Times New Roman" w:eastAsia="Times New Roman" w:hAnsi="Times New Roman"/>
+              </w:rPr>
+              <w:t xml:space="preserve">Exposé interactif, questions-réponses</w:t>
+            </w:r>
+          </w:p>
+        </w:tc>
+        <w:tc>
+          <w:tcPr>
+            <w:tcMar>
+              <w:top w:type="dxa" w:w="80"/>
+              <w:left w:type="dxa" w:w="80"/>
+              <w:bottom w:type="dxa" w:w="80"/>
+              <w:right w:type="dxa" w:w="80"/>
+            </w:tcMar>
+          </w:tcPr>
+          <w:p>
+            <w:pPr>
+              <w:spacing w:after="40"/>
+              <w:jc w:val="left"/>
+            </w:pPr>
+            <w:r>
+              <w:rPr>
+                <w:b w:val="false"/>
+                <w:bCs w:val="false"/>
+                <w:i w:val="false"/>
+                <w:iCs w:val="false"/>
+                <w:color w:val="000000"/>
+                <w:sz w:val="20"/>
+                <w:szCs w:val="20"/>
+                <w:rFonts w:ascii="Times New Roman" w:cs="Times New Roman" w:eastAsia="Times New Roman" w:hAnsi="Times New Roman"/>
+              </w:rPr>
+              <w:t xml:space="preserve">Tableau, frises, cartes</w:t>
+            </w:r>
+          </w:p>
+        </w:tc>
+        <w:tc>
+          <w:tcPr>
+            <w:tcMar>
+              <w:top w:type="dxa" w:w="80"/>
+              <w:left w:type="dxa" w:w="80"/>
+              <w:bottom w:type="dxa" w:w="80"/>
+              <w:right w:type="dxa" w:w="80"/>
+            </w:tcMar>
+          </w:tcPr>
+          <w:p>
+            <w:pPr>
+              <w:spacing w:after="40"/>
+              <w:jc w:val="left"/>
+            </w:pPr>
+            <w:r>
+              <w:rPr>
+                <w:b w:val="false"/>
+                <w:bCs w:val="false"/>
+                <w:i w:val="false"/>
+                <w:iCs w:val="false"/>
+                <w:color w:val="000000"/>
+                <w:sz w:val="20"/>
+                <w:szCs w:val="20"/>
+                <w:rFonts w:ascii="Times New Roman" w:cs="Times New Roman" w:eastAsia="Times New Roman" w:hAnsi="Times New Roman"/>
+              </w:rPr>
+              <w:t xml:space="preserve">Attention, participation</w:t>
             </w:r>
           </w:p>
         </w:tc>
@@ -4884,152 +5932,152 @@
                 <w:szCs w:val="20"/>
                 <w:rFonts w:ascii="Times New Roman" w:cs="Times New Roman" w:eastAsia="Times New Roman" w:hAnsi="Times New Roman"/>
               </w:rPr>
-              <w:t xml:space="preserve">4. Analyse</w:t>
-            </w:r>
-          </w:p>
-        </w:tc>
-        <w:tc>
-          <w:tcPr>
-            <w:tcMar>
-              <w:top w:type="dxa" w:w="80"/>
-              <w:left w:type="dxa" w:w="80"/>
-              <w:bottom w:type="dxa" w:w="80"/>
-              <w:right w:type="dxa" w:w="80"/>
-            </w:tcMar>
-          </w:tcPr>
-          <w:p>
-            <w:pPr>
-              <w:spacing w:after="40"/>
-              <w:jc w:val="left"/>
-            </w:pPr>
-            <w:r>
-              <w:rPr>
-                <w:b w:val="false"/>
-                <w:bCs w:val="false"/>
-                <w:i w:val="false"/>
-                <w:iCs w:val="false"/>
-                <w:color w:val="000000"/>
-                <w:sz w:val="20"/>
-                <w:szCs w:val="20"/>
-                <w:rFonts w:ascii="Times New Roman" w:cs="Times New Roman" w:eastAsia="Times New Roman" w:hAnsi="Times New Roman"/>
-              </w:rPr>
-              <w:t xml:space="preserve">Guide l’analyse : Appliquons les définitions comme un test scientifique. Test de l’ethnie : les Merina, les Vezo ou les Bara ont-ils des langues différentes ? Non — tous parlent le malgache, avec des variétés régionales qui se comprennent entre elles, comme les accents d’une même langue ; leur culture profonde — razana, fihavanana, riz, zébu — est commune. Le test échoue : pas d’ethnies. Test de la tribu : chaque groupe descend-il d’un ancêtre unique ? Non — l’unité IV l’a montré : toutes les régions sont nées du même brassage de vagues austronésiennes, africaines, arabes et européennes ; les généalogies se croisent d’un bout à l’autre de l’île. Le test échoue : pas de tribus. Reste le concept juste : le groupe de population — les habitants d’une région, unis par des coutumes locales, un habitat, des activités : les Vezo par la mer, les Betsileo par les terrasses, les Antandroy par les troupeaux. D’où viennent alors les mots « tribu » et « ethnie » ? Largement de l’époque coloniale : classer les Malgaches en « tribus » séparées servait à diviser pour régner — la fameuse politique des races de l’administration coloniale. Les abandonner n’est donc pas une coquetterie de vocabulaire : c’est un acte scientifique (les définitions ne s’appliquent pas) ET un acte civique (refuser les divisions héritées). Les mots font l’histoire : dire « groupe de population », c’est dire l’unité du peuple malgache.</w:t>
-            </w:r>
-          </w:p>
-        </w:tc>
-        <w:tc>
-          <w:tcPr>
-            <w:tcMar>
-              <w:top w:type="dxa" w:w="80"/>
-              <w:left w:type="dxa" w:w="80"/>
-              <w:bottom w:type="dxa" w:w="80"/>
-              <w:right w:type="dxa" w:w="80"/>
-            </w:tcMar>
-          </w:tcPr>
-          <w:p>
-            <w:pPr>
-              <w:spacing w:after="40"/>
-              <w:jc w:val="left"/>
-            </w:pPr>
-            <w:r>
-              <w:rPr>
-                <w:b w:val="false"/>
-                <w:bCs w:val="false"/>
-                <w:i w:val="false"/>
-                <w:iCs w:val="false"/>
-                <w:color w:val="000000"/>
-                <w:sz w:val="20"/>
-                <w:szCs w:val="20"/>
-                <w:rFonts w:ascii="Times New Roman" w:cs="Times New Roman" w:eastAsia="Times New Roman" w:hAnsi="Times New Roman"/>
-              </w:rPr>
-              <w:t xml:space="preserve">Expliquent la démarche et vérifient le résultat.</w:t>
-            </w:r>
-          </w:p>
-        </w:tc>
-        <w:tc>
-          <w:tcPr>
-            <w:tcMar>
-              <w:top w:type="dxa" w:w="80"/>
-              <w:left w:type="dxa" w:w="80"/>
-              <w:bottom w:type="dxa" w:w="80"/>
-              <w:right w:type="dxa" w:w="80"/>
-            </w:tcMar>
-          </w:tcPr>
-          <w:p>
-            <w:pPr>
-              <w:spacing w:after="40"/>
-              <w:jc w:val="left"/>
-            </w:pPr>
-            <w:r>
-              <w:rPr>
-                <w:b w:val="false"/>
-                <w:bCs w:val="false"/>
-                <w:i w:val="false"/>
-                <w:iCs w:val="false"/>
-                <w:color w:val="000000"/>
-                <w:sz w:val="20"/>
-                <w:szCs w:val="20"/>
-                <w:rFonts w:ascii="Times New Roman" w:cs="Times New Roman" w:eastAsia="Times New Roman" w:hAnsi="Times New Roman"/>
-              </w:rPr>
-              <w:t xml:space="preserve">Recherche en binômes</w:t>
-            </w:r>
-          </w:p>
-        </w:tc>
-        <w:tc>
-          <w:tcPr>
-            <w:tcMar>
-              <w:top w:type="dxa" w:w="80"/>
-              <w:left w:type="dxa" w:w="80"/>
-              <w:bottom w:type="dxa" w:w="80"/>
-              <w:right w:type="dxa" w:w="80"/>
-            </w:tcMar>
-          </w:tcPr>
-          <w:p>
-            <w:pPr>
-              <w:spacing w:after="40"/>
-              <w:jc w:val="left"/>
-            </w:pPr>
-            <w:r>
-              <w:rPr>
-                <w:b w:val="false"/>
-                <w:bCs w:val="false"/>
-                <w:i w:val="false"/>
-                <w:iCs w:val="false"/>
-                <w:color w:val="000000"/>
-                <w:sz w:val="20"/>
-                <w:szCs w:val="20"/>
-                <w:rFonts w:ascii="Times New Roman" w:cs="Times New Roman" w:eastAsia="Times New Roman" w:hAnsi="Times New Roman"/>
-              </w:rPr>
-              <w:t xml:space="preserve">Documents, cartes, frises</w:t>
-            </w:r>
-          </w:p>
-        </w:tc>
-        <w:tc>
-          <w:tcPr>
-            <w:tcMar>
-              <w:top w:type="dxa" w:w="80"/>
-              <w:left w:type="dxa" w:w="80"/>
-              <w:bottom w:type="dxa" w:w="80"/>
-              <w:right w:type="dxa" w:w="80"/>
-            </w:tcMar>
-          </w:tcPr>
-          <w:p>
-            <w:pPr>
-              <w:spacing w:after="40"/>
-              <w:jc w:val="left"/>
-            </w:pPr>
-            <w:r>
-              <w:rPr>
-                <w:b w:val="false"/>
-                <w:bCs w:val="false"/>
-                <w:i w:val="false"/>
-                <w:iCs w:val="false"/>
-                <w:color w:val="000000"/>
-                <w:sz w:val="20"/>
-                <w:szCs w:val="20"/>
-                <w:rFonts w:ascii="Times New Roman" w:cs="Times New Roman" w:eastAsia="Times New Roman" w:hAnsi="Times New Roman"/>
-              </w:rPr>
-              <w:t xml:space="preserve">Raisonnement</w:t>
+              <w:t xml:space="preserve">4. Étude de document</w:t>
+            </w:r>
+          </w:p>
+        </w:tc>
+        <w:tc>
+          <w:tcPr>
+            <w:tcMar>
+              <w:top w:type="dxa" w:w="80"/>
+              <w:left w:type="dxa" w:w="80"/>
+              <w:bottom w:type="dxa" w:w="80"/>
+              <w:right w:type="dxa" w:w="80"/>
+            </w:tcMar>
+          </w:tcPr>
+          <w:p>
+            <w:pPr>
+              <w:spacing w:after="40"/>
+              <w:jc w:val="left"/>
+            </w:pPr>
+            <w:r>
+              <w:rPr>
+                <w:b w:val="false"/>
+                <w:bCs w:val="false"/>
+                <w:i w:val="false"/>
+                <w:iCs w:val="false"/>
+                <w:color w:val="000000"/>
+                <w:sz w:val="20"/>
+                <w:szCs w:val="20"/>
+                <w:rFonts w:ascii="Times New Roman" w:cs="Times New Roman" w:eastAsia="Times New Roman" w:hAnsi="Times New Roman"/>
+              </w:rPr>
+              <w:t xml:space="preserve">Fait lire le document « La « politique des races » du colonisateur » (d’après les instructions du général Gallieni, gouverneur de Madagascar (1898) — extrait adapté), puis pose les questions.</w:t>
+            </w:r>
+          </w:p>
+        </w:tc>
+        <w:tc>
+          <w:tcPr>
+            <w:tcMar>
+              <w:top w:type="dxa" w:w="80"/>
+              <w:left w:type="dxa" w:w="80"/>
+              <w:bottom w:type="dxa" w:w="80"/>
+              <w:right w:type="dxa" w:w="80"/>
+            </w:tcMar>
+          </w:tcPr>
+          <w:p>
+            <w:pPr>
+              <w:spacing w:after="40"/>
+              <w:jc w:val="left"/>
+            </w:pPr>
+            <w:r>
+              <w:rPr>
+                <w:b w:val="false"/>
+                <w:bCs w:val="false"/>
+                <w:i w:val="false"/>
+                <w:iCs w:val="false"/>
+                <w:color w:val="000000"/>
+                <w:sz w:val="20"/>
+                <w:szCs w:val="20"/>
+                <w:rFonts w:ascii="Times New Roman" w:cs="Times New Roman" w:eastAsia="Times New Roman" w:hAnsi="Times New Roman"/>
+              </w:rPr>
+              <w:t xml:space="preserve">Lisent le document, répondent aux questions et critiquent la source.</w:t>
+            </w:r>
+          </w:p>
+        </w:tc>
+        <w:tc>
+          <w:tcPr>
+            <w:tcMar>
+              <w:top w:type="dxa" w:w="80"/>
+              <w:left w:type="dxa" w:w="80"/>
+              <w:bottom w:type="dxa" w:w="80"/>
+              <w:right w:type="dxa" w:w="80"/>
+            </w:tcMar>
+          </w:tcPr>
+          <w:p>
+            <w:pPr>
+              <w:spacing w:after="40"/>
+              <w:jc w:val="left"/>
+            </w:pPr>
+            <w:r>
+              <w:rPr>
+                <w:b w:val="false"/>
+                <w:bCs w:val="false"/>
+                <w:i w:val="false"/>
+                <w:iCs w:val="false"/>
+                <w:color w:val="000000"/>
+                <w:sz w:val="20"/>
+                <w:szCs w:val="20"/>
+                <w:rFonts w:ascii="Times New Roman" w:cs="Times New Roman" w:eastAsia="Times New Roman" w:hAnsi="Times New Roman"/>
+              </w:rPr>
+              <w:t xml:space="preserve">Observation dirigée, travail en binômes</w:t>
+            </w:r>
+          </w:p>
+        </w:tc>
+        <w:tc>
+          <w:tcPr>
+            <w:tcMar>
+              <w:top w:type="dxa" w:w="80"/>
+              <w:left w:type="dxa" w:w="80"/>
+              <w:bottom w:type="dxa" w:w="80"/>
+              <w:right w:type="dxa" w:w="80"/>
+            </w:tcMar>
+          </w:tcPr>
+          <w:p>
+            <w:pPr>
+              <w:spacing w:after="40"/>
+              <w:jc w:val="left"/>
+            </w:pPr>
+            <w:r>
+              <w:rPr>
+                <w:b w:val="false"/>
+                <w:bCs w:val="false"/>
+                <w:i w:val="false"/>
+                <w:iCs w:val="false"/>
+                <w:color w:val="000000"/>
+                <w:sz w:val="20"/>
+                <w:szCs w:val="20"/>
+                <w:rFonts w:ascii="Times New Roman" w:cs="Times New Roman" w:eastAsia="Times New Roman" w:hAnsi="Times New Roman"/>
+              </w:rPr>
+              <w:t xml:space="preserve">Document imprimé</w:t>
+            </w:r>
+          </w:p>
+        </w:tc>
+        <w:tc>
+          <w:tcPr>
+            <w:tcMar>
+              <w:top w:type="dxa" w:w="80"/>
+              <w:left w:type="dxa" w:w="80"/>
+              <w:bottom w:type="dxa" w:w="80"/>
+              <w:right w:type="dxa" w:w="80"/>
+            </w:tcMar>
+          </w:tcPr>
+          <w:p>
+            <w:pPr>
+              <w:spacing w:after="40"/>
+              <w:jc w:val="left"/>
+            </w:pPr>
+            <w:r>
+              <w:rPr>
+                <w:b w:val="false"/>
+                <w:bCs w:val="false"/>
+                <w:i w:val="false"/>
+                <w:iCs w:val="false"/>
+                <w:color w:val="000000"/>
+                <w:sz w:val="20"/>
+                <w:szCs w:val="20"/>
+                <w:rFonts w:ascii="Times New Roman" w:cs="Times New Roman" w:eastAsia="Times New Roman" w:hAnsi="Times New Roman"/>
+              </w:rPr>
+              <w:t xml:space="preserve">Esprit critique</w:t>
             </w:r>
           </w:p>
         </w:tc>
@@ -5635,7 +6683,26 @@
     </w:p>
     <w:p>
       <w:pPr>
-        <w:spacing w:after="110" w:line="300"/>
+        <w:spacing w:after="160" w:line="300"/>
+        <w:jc w:val="center"/>
+      </w:pPr>
+      <w:r>
+        <w:rPr>
+          <w:b w:val="false"/>
+          <w:bCs w:val="false"/>
+          <w:i/>
+          <w:iCs/>
+          <w:color w:val="000000"/>
+          <w:sz w:val="21"/>
+          <w:szCs w:val="21"/>
+          <w:rFonts w:ascii="Times New Roman" w:cs="Times New Roman" w:eastAsia="Times New Roman" w:hAnsi="Times New Roman"/>
+        </w:rPr>
+        <w:t xml:space="preserve">Le dictionnaire en main, l’historien teste chaque mot : « ethnie » ? « tribu » ? La science répond : ni l’un ni l’autre.</w:t>
+      </w:r>
+    </w:p>
+    <w:p>
+      <w:pPr>
+        <w:spacing w:after="80" w:line="300"/>
         <w:jc w:val="both"/>
       </w:pPr>
       <w:r>
@@ -5645,11 +6712,49 @@
           <w:i w:val="false"/>
           <w:iCs w:val="false"/>
           <w:color w:val="2E7D32"/>
-          <w:sz w:val="24"/>
-          <w:szCs w:val="24"/>
-          <w:rFonts w:ascii="Times New Roman" w:cs="Times New Roman" w:eastAsia="Times New Roman" w:hAnsi="Times New Roman"/>
-        </w:rPr>
-        <w:t xml:space="preserve">Définition — </w:t>
+          <w:sz w:val="26"/>
+          <w:szCs w:val="26"/>
+          <w:rFonts w:ascii="Times New Roman" w:cs="Times New Roman" w:eastAsia="Times New Roman" w:hAnsi="Times New Roman"/>
+        </w:rPr>
+        <w:t xml:space="preserve">1. Trois concepts, trois définitions</w:t>
+      </w:r>
+    </w:p>
+    <w:p>
+      <w:pPr>
+        <w:spacing w:after="100" w:line="300"/>
+        <w:jc w:val="both"/>
+      </w:pPr>
+      <w:r>
+        <w:rPr>
+          <w:b w:val="false"/>
+          <w:bCs w:val="false"/>
+          <w:i w:val="false"/>
+          <w:iCs w:val="false"/>
+          <w:color w:val="000000"/>
+          <w:sz w:val="24"/>
+          <w:szCs w:val="24"/>
+          <w:rFonts w:ascii="Times New Roman" w:cs="Times New Roman" w:eastAsia="Times New Roman" w:hAnsi="Times New Roman"/>
+        </w:rPr>
+        <w:t xml:space="preserve">Avant de juger, définissons :</w:t>
+      </w:r>
+    </w:p>
+    <w:p>
+      <w:pPr>
+        <w:spacing w:after="60" w:line="300"/>
+        <w:jc w:val="both"/>
+      </w:pPr>
+      <w:r>
+        <w:rPr>
+          <w:b w:val="false"/>
+          <w:bCs w:val="false"/>
+          <w:i w:val="false"/>
+          <w:iCs w:val="false"/>
+          <w:color w:val="000000"/>
+          <w:sz w:val="24"/>
+          <w:szCs w:val="24"/>
+          <w:rFonts w:ascii="Times New Roman" w:cs="Times New Roman" w:eastAsia="Times New Roman" w:hAnsi="Times New Roman"/>
+        </w:rPr>
+        <w:t xml:space="preserve">• une </w:t>
       </w:r>
       <w:r>
         <w:rPr>
@@ -5657,19 +6762,45 @@
           <w:bCs/>
           <w:i w:val="false"/>
           <w:iCs w:val="false"/>
+          <w:color w:val="1F4E79"/>
+          <w:sz w:val="24"/>
+          <w:szCs w:val="24"/>
+          <w:rFonts w:ascii="Times New Roman" w:cs="Times New Roman" w:eastAsia="Times New Roman" w:hAnsi="Times New Roman"/>
+        </w:rPr>
+        <w:t xml:space="preserve">ethnie</w:t>
+      </w:r>
+      <w:r>
+        <w:rPr>
+          <w:b w:val="false"/>
+          <w:bCs w:val="false"/>
+          <w:i w:val="false"/>
+          <w:iCs w:val="false"/>
           <w:color w:val="000000"/>
           <w:sz w:val="24"/>
           <w:szCs w:val="24"/>
           <w:rFonts w:ascii="Times New Roman" w:cs="Times New Roman" w:eastAsia="Times New Roman" w:hAnsi="Times New Roman"/>
         </w:rPr>
-        <w:t xml:space="preserve">Une ethnie est un peuple qui possède sa propre langue et sa propre culture, distinctes de celles de ses voisins. Une tribu est un groupe uni par la descendance d’un ancêtre commun, réel ou supposé. Un groupe de population est simplement l’ensemble des habitants d’une même région, partageant des coutumes locales. Tout compte fait, à Madagascar, il n’y a ni ethnie ni tribu : les Malgaches parlent une seule langue et partagent une même culture — on parle donc de groupes de population.</w:t>
-      </w:r>
-    </w:p>
-    <w:p>
-      <w:pPr>
-        <w:spacing w:after="110" w:line="300"/>
+        <w:t xml:space="preserve"> est un peuple qui possède sa propre langue et sa propre culture, distinctes de celles de ses voisins ;</w:t>
+      </w:r>
+    </w:p>
+    <w:p>
+      <w:pPr>
+        <w:spacing w:after="60" w:line="300"/>
         <w:jc w:val="both"/>
       </w:pPr>
+      <w:r>
+        <w:rPr>
+          <w:b w:val="false"/>
+          <w:bCs w:val="false"/>
+          <w:i w:val="false"/>
+          <w:iCs w:val="false"/>
+          <w:color w:val="000000"/>
+          <w:sz w:val="24"/>
+          <w:szCs w:val="24"/>
+          <w:rFonts w:ascii="Times New Roman" w:cs="Times New Roman" w:eastAsia="Times New Roman" w:hAnsi="Times New Roman"/>
+        </w:rPr>
+        <w:t xml:space="preserve">• une </w:t>
+      </w:r>
       <w:r>
         <w:rPr>
           <w:b/>
@@ -5681,7 +6812,7 @@
           <w:szCs w:val="24"/>
           <w:rFonts w:ascii="Times New Roman" w:cs="Times New Roman" w:eastAsia="Times New Roman" w:hAnsi="Times New Roman"/>
         </w:rPr>
-        <w:t xml:space="preserve">Autrement dit : </w:t>
+        <w:t xml:space="preserve">tribu</w:t>
       </w:r>
       <w:r>
         <w:rPr>
@@ -5694,12 +6825,12 @@
           <w:szCs w:val="24"/>
           <w:rFonts w:ascii="Times New Roman" w:cs="Times New Roman" w:eastAsia="Times New Roman" w:hAnsi="Times New Roman"/>
         </w:rPr>
-        <w:t xml:space="preserve">ethnie = langue et culture à part ; tribu = un ancêtre commun ; groupe de population = les gens d’une région. Les Malgaches partageant langue et culture, seuls les « groupes de population » existent chez nous.</w:t>
-      </w:r>
-    </w:p>
-    <w:p>
-      <w:pPr>
-        <w:spacing w:after="110" w:line="300"/>
+        <w:t xml:space="preserve"> est un groupe uni par la descendance d’un ancêtre commun, réel ou supposé ;</w:t>
+      </w:r>
+    </w:p>
+    <w:p>
+      <w:pPr>
+        <w:spacing w:after="60" w:line="300"/>
         <w:jc w:val="both"/>
       </w:pPr>
       <w:r>
@@ -5713,7 +6844,485 @@
           <w:szCs w:val="24"/>
           <w:rFonts w:ascii="Times New Roman" w:cs="Times New Roman" w:eastAsia="Times New Roman" w:hAnsi="Times New Roman"/>
         </w:rPr>
-        <w:t xml:space="preserve">Appliquons les définitions comme un test scientifique. Test de l’ethnie : les Merina, les Vezo ou les Bara ont-ils des langues différentes ? Non — tous parlent le malgache, avec des variétés régionales qui se comprennent entre elles, comme les accents d’une même langue ; leur culture profonde — razana, fihavanana, riz, zébu — est commune. Le test échoue : pas d’ethnies. Test de la tribu : chaque groupe descend-il d’un ancêtre unique ? Non — l’unité IV l’a montré : toutes les régions sont nées du même brassage de vagues austronésiennes, africaines, arabes et européennes ; les généalogies se croisent d’un bout à l’autre de l’île. Le test échoue : pas de tribus. Reste le concept juste : le groupe de population — les habitants d’une région, unis par des coutumes locales, un habitat, des activités : les Vezo par la mer, les Betsileo par les terrasses, les Antandroy par les troupeaux. D’où viennent alors les mots « tribu » et « ethnie » ? Largement de l’époque coloniale : classer les Malgaches en « tribus » séparées servait à diviser pour régner — la fameuse politique des races de l’administration coloniale. Les abandonner n’est donc pas une coquetterie de vocabulaire : c’est un acte scientifique (les définitions ne s’appliquent pas) ET un acte civique (refuser les divisions héritées). Les mots font l’histoire : dire « groupe de population », c’est dire l’unité du peuple malgache.</w:t>
+        <w:t xml:space="preserve">• un </w:t>
+      </w:r>
+      <w:r>
+        <w:rPr>
+          <w:b/>
+          <w:bCs/>
+          <w:i w:val="false"/>
+          <w:iCs w:val="false"/>
+          <w:color w:val="1F4E79"/>
+          <w:sz w:val="24"/>
+          <w:szCs w:val="24"/>
+          <w:rFonts w:ascii="Times New Roman" w:cs="Times New Roman" w:eastAsia="Times New Roman" w:hAnsi="Times New Roman"/>
+        </w:rPr>
+        <w:t xml:space="preserve">groupe de population</w:t>
+      </w:r>
+      <w:r>
+        <w:rPr>
+          <w:b w:val="false"/>
+          <w:bCs w:val="false"/>
+          <w:i w:val="false"/>
+          <w:iCs w:val="false"/>
+          <w:color w:val="000000"/>
+          <w:sz w:val="24"/>
+          <w:szCs w:val="24"/>
+          <w:rFonts w:ascii="Times New Roman" w:cs="Times New Roman" w:eastAsia="Times New Roman" w:hAnsi="Times New Roman"/>
+        </w:rPr>
+        <w:t xml:space="preserve"> est simplement l’ensemble des habitants d’une même région, partageant des coutumes locales.</w:t>
+      </w:r>
+    </w:p>
+    <w:p>
+      <w:pPr>
+        <w:spacing w:after="80" w:line="300"/>
+        <w:jc w:val="both"/>
+      </w:pPr>
+      <w:r>
+        <w:rPr>
+          <w:b/>
+          <w:bCs/>
+          <w:i w:val="false"/>
+          <w:iCs w:val="false"/>
+          <w:color w:val="2E7D32"/>
+          <w:sz w:val="26"/>
+          <w:szCs w:val="26"/>
+          <w:rFonts w:ascii="Times New Roman" w:cs="Times New Roman" w:eastAsia="Times New Roman" w:hAnsi="Times New Roman"/>
+        </w:rPr>
+        <w:t xml:space="preserve">2. Le double test appliqué à Madagascar</w:t>
+      </w:r>
+    </w:p>
+    <w:p>
+      <w:pPr>
+        <w:spacing w:after="100" w:line="300"/>
+        <w:jc w:val="both"/>
+      </w:pPr>
+      <w:r>
+        <w:rPr>
+          <w:b w:val="false"/>
+          <w:bCs w:val="false"/>
+          <w:i w:val="false"/>
+          <w:iCs w:val="false"/>
+          <w:color w:val="000000"/>
+          <w:sz w:val="24"/>
+          <w:szCs w:val="24"/>
+          <w:rFonts w:ascii="Times New Roman" w:cs="Times New Roman" w:eastAsia="Times New Roman" w:hAnsi="Times New Roman"/>
+        </w:rPr>
+        <w:t xml:space="preserve">Test de l’</w:t>
+      </w:r>
+      <w:r>
+        <w:rPr>
+          <w:b/>
+          <w:bCs/>
+          <w:i w:val="false"/>
+          <w:iCs w:val="false"/>
+          <w:color w:val="1F4E79"/>
+          <w:sz w:val="24"/>
+          <w:szCs w:val="24"/>
+          <w:rFonts w:ascii="Times New Roman" w:cs="Times New Roman" w:eastAsia="Times New Roman" w:hAnsi="Times New Roman"/>
+        </w:rPr>
+        <w:t xml:space="preserve">ethnie</w:t>
+      </w:r>
+      <w:r>
+        <w:rPr>
+          <w:b w:val="false"/>
+          <w:bCs w:val="false"/>
+          <w:i w:val="false"/>
+          <w:iCs w:val="false"/>
+          <w:color w:val="000000"/>
+          <w:sz w:val="24"/>
+          <w:szCs w:val="24"/>
+          <w:rFonts w:ascii="Times New Roman" w:cs="Times New Roman" w:eastAsia="Times New Roman" w:hAnsi="Times New Roman"/>
+        </w:rPr>
+        <w:t xml:space="preserve"> : les Merina, les Vezo ou les Bara ont-ils des langues différentes ? Non — tous parlent le malgache, avec des variétés régionales qui se comprennent entre elles, comme les accents d’une même langue ; leur culture profonde — razana, fihavanana, riz, zébu — est commune. Le test échoue : pas d’</w:t>
+      </w:r>
+      <w:r>
+        <w:rPr>
+          <w:b/>
+          <w:bCs/>
+          <w:i w:val="false"/>
+          <w:iCs w:val="false"/>
+          <w:color w:val="1F4E79"/>
+          <w:sz w:val="24"/>
+          <w:szCs w:val="24"/>
+          <w:rFonts w:ascii="Times New Roman" w:cs="Times New Roman" w:eastAsia="Times New Roman" w:hAnsi="Times New Roman"/>
+        </w:rPr>
+        <w:t xml:space="preserve">ethnie</w:t>
+      </w:r>
+      <w:r>
+        <w:rPr>
+          <w:b w:val="false"/>
+          <w:bCs w:val="false"/>
+          <w:i w:val="false"/>
+          <w:iCs w:val="false"/>
+          <w:color w:val="000000"/>
+          <w:sz w:val="24"/>
+          <w:szCs w:val="24"/>
+          <w:rFonts w:ascii="Times New Roman" w:cs="Times New Roman" w:eastAsia="Times New Roman" w:hAnsi="Times New Roman"/>
+        </w:rPr>
+        <w:t xml:space="preserve">s.</w:t>
+      </w:r>
+    </w:p>
+    <w:p>
+      <w:pPr>
+        <w:spacing w:after="100" w:line="300"/>
+        <w:jc w:val="both"/>
+      </w:pPr>
+      <w:r>
+        <w:rPr>
+          <w:b w:val="false"/>
+          <w:bCs w:val="false"/>
+          <w:i w:val="false"/>
+          <w:iCs w:val="false"/>
+          <w:color w:val="000000"/>
+          <w:sz w:val="24"/>
+          <w:szCs w:val="24"/>
+          <w:rFonts w:ascii="Times New Roman" w:cs="Times New Roman" w:eastAsia="Times New Roman" w:hAnsi="Times New Roman"/>
+        </w:rPr>
+        <w:t xml:space="preserve">Test de la </w:t>
+      </w:r>
+      <w:r>
+        <w:rPr>
+          <w:b/>
+          <w:bCs/>
+          <w:i w:val="false"/>
+          <w:iCs w:val="false"/>
+          <w:color w:val="1F4E79"/>
+          <w:sz w:val="24"/>
+          <w:szCs w:val="24"/>
+          <w:rFonts w:ascii="Times New Roman" w:cs="Times New Roman" w:eastAsia="Times New Roman" w:hAnsi="Times New Roman"/>
+        </w:rPr>
+        <w:t xml:space="preserve">tribu</w:t>
+      </w:r>
+      <w:r>
+        <w:rPr>
+          <w:b w:val="false"/>
+          <w:bCs w:val="false"/>
+          <w:i w:val="false"/>
+          <w:iCs w:val="false"/>
+          <w:color w:val="000000"/>
+          <w:sz w:val="24"/>
+          <w:szCs w:val="24"/>
+          <w:rFonts w:ascii="Times New Roman" w:cs="Times New Roman" w:eastAsia="Times New Roman" w:hAnsi="Times New Roman"/>
+        </w:rPr>
+        <w:t xml:space="preserve"> : chaque groupe descend-il d’un ancêtre unique ? Non — l’unité IV l’a montré : toutes les régions sont nées du même </w:t>
+      </w:r>
+      <w:r>
+        <w:rPr>
+          <w:b/>
+          <w:bCs/>
+          <w:i w:val="false"/>
+          <w:iCs w:val="false"/>
+          <w:color w:val="1F4E79"/>
+          <w:sz w:val="24"/>
+          <w:szCs w:val="24"/>
+          <w:rFonts w:ascii="Times New Roman" w:cs="Times New Roman" w:eastAsia="Times New Roman" w:hAnsi="Times New Roman"/>
+        </w:rPr>
+        <w:t xml:space="preserve">brassage</w:t>
+      </w:r>
+      <w:r>
+        <w:rPr>
+          <w:b w:val="false"/>
+          <w:bCs w:val="false"/>
+          <w:i w:val="false"/>
+          <w:iCs w:val="false"/>
+          <w:color w:val="000000"/>
+          <w:sz w:val="24"/>
+          <w:szCs w:val="24"/>
+          <w:rFonts w:ascii="Times New Roman" w:cs="Times New Roman" w:eastAsia="Times New Roman" w:hAnsi="Times New Roman"/>
+        </w:rPr>
+        <w:t xml:space="preserve"> de vagues austronésiennes, africaines, arabes et européennes ; les généalogies se croisent d’un bout à l’autre de l’île. Le test échoue : pas de </w:t>
+      </w:r>
+      <w:r>
+        <w:rPr>
+          <w:b/>
+          <w:bCs/>
+          <w:i w:val="false"/>
+          <w:iCs w:val="false"/>
+          <w:color w:val="1F4E79"/>
+          <w:sz w:val="24"/>
+          <w:szCs w:val="24"/>
+          <w:rFonts w:ascii="Times New Roman" w:cs="Times New Roman" w:eastAsia="Times New Roman" w:hAnsi="Times New Roman"/>
+        </w:rPr>
+        <w:t xml:space="preserve">tribu</w:t>
+      </w:r>
+      <w:r>
+        <w:rPr>
+          <w:b w:val="false"/>
+          <w:bCs w:val="false"/>
+          <w:i w:val="false"/>
+          <w:iCs w:val="false"/>
+          <w:color w:val="000000"/>
+          <w:sz w:val="24"/>
+          <w:szCs w:val="24"/>
+          <w:rFonts w:ascii="Times New Roman" w:cs="Times New Roman" w:eastAsia="Times New Roman" w:hAnsi="Times New Roman"/>
+        </w:rPr>
+        <w:t xml:space="preserve">s.</w:t>
+      </w:r>
+    </w:p>
+    <w:p>
+      <w:pPr>
+        <w:spacing w:after="100" w:line="300"/>
+        <w:jc w:val="both"/>
+      </w:pPr>
+      <w:r>
+        <w:rPr>
+          <w:b w:val="false"/>
+          <w:bCs w:val="false"/>
+          <w:i w:val="false"/>
+          <w:iCs w:val="false"/>
+          <w:color w:val="000000"/>
+          <w:sz w:val="24"/>
+          <w:szCs w:val="24"/>
+          <w:rFonts w:ascii="Times New Roman" w:cs="Times New Roman" w:eastAsia="Times New Roman" w:hAnsi="Times New Roman"/>
+        </w:rPr>
+        <w:t xml:space="preserve">Reste le concept juste : le </w:t>
+      </w:r>
+      <w:r>
+        <w:rPr>
+          <w:b/>
+          <w:bCs/>
+          <w:i w:val="false"/>
+          <w:iCs w:val="false"/>
+          <w:color w:val="1F4E79"/>
+          <w:sz w:val="24"/>
+          <w:szCs w:val="24"/>
+          <w:rFonts w:ascii="Times New Roman" w:cs="Times New Roman" w:eastAsia="Times New Roman" w:hAnsi="Times New Roman"/>
+        </w:rPr>
+        <w:t xml:space="preserve">groupe de population</w:t>
+      </w:r>
+      <w:r>
+        <w:rPr>
+          <w:b w:val="false"/>
+          <w:bCs w:val="false"/>
+          <w:i w:val="false"/>
+          <w:iCs w:val="false"/>
+          <w:color w:val="000000"/>
+          <w:sz w:val="24"/>
+          <w:szCs w:val="24"/>
+          <w:rFonts w:ascii="Times New Roman" w:cs="Times New Roman" w:eastAsia="Times New Roman" w:hAnsi="Times New Roman"/>
+        </w:rPr>
+        <w:t xml:space="preserve"> — les habitants d’une région, unis par des coutumes locales, un habitat, des activités : les Vezo par la mer, les Betsileo par les terrasses, les Antandroy par les troupeaux.</w:t>
+      </w:r>
+    </w:p>
+    <w:p>
+      <w:pPr>
+        <w:spacing w:after="80" w:line="300"/>
+        <w:jc w:val="both"/>
+      </w:pPr>
+      <w:r>
+        <w:rPr>
+          <w:b/>
+          <w:bCs/>
+          <w:i w:val="false"/>
+          <w:iCs w:val="false"/>
+          <w:color w:val="2E7D32"/>
+          <w:sz w:val="26"/>
+          <w:szCs w:val="26"/>
+          <w:rFonts w:ascii="Times New Roman" w:cs="Times New Roman" w:eastAsia="Times New Roman" w:hAnsi="Times New Roman"/>
+        </w:rPr>
+        <w:t xml:space="preserve">3. Les mots font l’histoire</w:t>
+      </w:r>
+    </w:p>
+    <w:p>
+      <w:pPr>
+        <w:spacing w:after="100" w:line="300"/>
+        <w:jc w:val="both"/>
+      </w:pPr>
+      <w:r>
+        <w:rPr>
+          <w:b w:val="false"/>
+          <w:bCs w:val="false"/>
+          <w:i w:val="false"/>
+          <w:iCs w:val="false"/>
+          <w:color w:val="000000"/>
+          <w:sz w:val="24"/>
+          <w:szCs w:val="24"/>
+          <w:rFonts w:ascii="Times New Roman" w:cs="Times New Roman" w:eastAsia="Times New Roman" w:hAnsi="Times New Roman"/>
+        </w:rPr>
+        <w:t xml:space="preserve">D’où viennent alors les mots « </w:t>
+      </w:r>
+      <w:r>
+        <w:rPr>
+          <w:b/>
+          <w:bCs/>
+          <w:i w:val="false"/>
+          <w:iCs w:val="false"/>
+          <w:color w:val="1F4E79"/>
+          <w:sz w:val="24"/>
+          <w:szCs w:val="24"/>
+          <w:rFonts w:ascii="Times New Roman" w:cs="Times New Roman" w:eastAsia="Times New Roman" w:hAnsi="Times New Roman"/>
+        </w:rPr>
+        <w:t xml:space="preserve">tribu</w:t>
+      </w:r>
+      <w:r>
+        <w:rPr>
+          <w:b w:val="false"/>
+          <w:bCs w:val="false"/>
+          <w:i w:val="false"/>
+          <w:iCs w:val="false"/>
+          <w:color w:val="000000"/>
+          <w:sz w:val="24"/>
+          <w:szCs w:val="24"/>
+          <w:rFonts w:ascii="Times New Roman" w:cs="Times New Roman" w:eastAsia="Times New Roman" w:hAnsi="Times New Roman"/>
+        </w:rPr>
+        <w:t xml:space="preserve"> » et « </w:t>
+      </w:r>
+      <w:r>
+        <w:rPr>
+          <w:b/>
+          <w:bCs/>
+          <w:i w:val="false"/>
+          <w:iCs w:val="false"/>
+          <w:color w:val="1F4E79"/>
+          <w:sz w:val="24"/>
+          <w:szCs w:val="24"/>
+          <w:rFonts w:ascii="Times New Roman" w:cs="Times New Roman" w:eastAsia="Times New Roman" w:hAnsi="Times New Roman"/>
+        </w:rPr>
+        <w:t xml:space="preserve">ethnie</w:t>
+      </w:r>
+      <w:r>
+        <w:rPr>
+          <w:b w:val="false"/>
+          <w:bCs w:val="false"/>
+          <w:i w:val="false"/>
+          <w:iCs w:val="false"/>
+          <w:color w:val="000000"/>
+          <w:sz w:val="24"/>
+          <w:szCs w:val="24"/>
+          <w:rFonts w:ascii="Times New Roman" w:cs="Times New Roman" w:eastAsia="Times New Roman" w:hAnsi="Times New Roman"/>
+        </w:rPr>
+        <w:t xml:space="preserve"> » ? Largement de l’</w:t>
+      </w:r>
+      <w:r>
+        <w:rPr>
+          <w:b/>
+          <w:bCs/>
+          <w:i w:val="false"/>
+          <w:iCs w:val="false"/>
+          <w:color w:val="1F4E79"/>
+          <w:sz w:val="24"/>
+          <w:szCs w:val="24"/>
+          <w:rFonts w:ascii="Times New Roman" w:cs="Times New Roman" w:eastAsia="Times New Roman" w:hAnsi="Times New Roman"/>
+        </w:rPr>
+        <w:t xml:space="preserve">époque coloniale</w:t>
+      </w:r>
+      <w:r>
+        <w:rPr>
+          <w:b w:val="false"/>
+          <w:bCs w:val="false"/>
+          <w:i w:val="false"/>
+          <w:iCs w:val="false"/>
+          <w:color w:val="000000"/>
+          <w:sz w:val="24"/>
+          <w:szCs w:val="24"/>
+          <w:rFonts w:ascii="Times New Roman" w:cs="Times New Roman" w:eastAsia="Times New Roman" w:hAnsi="Times New Roman"/>
+        </w:rPr>
+        <w:t xml:space="preserve"> : classer les Malgaches en « </w:t>
+      </w:r>
+      <w:r>
+        <w:rPr>
+          <w:b/>
+          <w:bCs/>
+          <w:i w:val="false"/>
+          <w:iCs w:val="false"/>
+          <w:color w:val="1F4E79"/>
+          <w:sz w:val="24"/>
+          <w:szCs w:val="24"/>
+          <w:rFonts w:ascii="Times New Roman" w:cs="Times New Roman" w:eastAsia="Times New Roman" w:hAnsi="Times New Roman"/>
+        </w:rPr>
+        <w:t xml:space="preserve">tribu</w:t>
+      </w:r>
+      <w:r>
+        <w:rPr>
+          <w:b w:val="false"/>
+          <w:bCs w:val="false"/>
+          <w:i w:val="false"/>
+          <w:iCs w:val="false"/>
+          <w:color w:val="000000"/>
+          <w:sz w:val="24"/>
+          <w:szCs w:val="24"/>
+          <w:rFonts w:ascii="Times New Roman" w:cs="Times New Roman" w:eastAsia="Times New Roman" w:hAnsi="Times New Roman"/>
+        </w:rPr>
+        <w:t xml:space="preserve">s » séparées servait à diviser pour régner — la fameuse </w:t>
+      </w:r>
+      <w:r>
+        <w:rPr>
+          <w:b/>
+          <w:bCs/>
+          <w:i w:val="false"/>
+          <w:iCs w:val="false"/>
+          <w:color w:val="1F4E79"/>
+          <w:sz w:val="24"/>
+          <w:szCs w:val="24"/>
+          <w:rFonts w:ascii="Times New Roman" w:cs="Times New Roman" w:eastAsia="Times New Roman" w:hAnsi="Times New Roman"/>
+        </w:rPr>
+        <w:t xml:space="preserve">politique des races</w:t>
+      </w:r>
+      <w:r>
+        <w:rPr>
+          <w:b w:val="false"/>
+          <w:bCs w:val="false"/>
+          <w:i w:val="false"/>
+          <w:iCs w:val="false"/>
+          <w:color w:val="000000"/>
+          <w:sz w:val="24"/>
+          <w:szCs w:val="24"/>
+          <w:rFonts w:ascii="Times New Roman" w:cs="Times New Roman" w:eastAsia="Times New Roman" w:hAnsi="Times New Roman"/>
+        </w:rPr>
+        <w:t xml:space="preserve"> de l’administration coloniale. Les abandonner n’est donc pas une coquetterie de vocabulaire : c’est un acte scientifique (les définitions ne s’appliquent pas) ET un acte civique (refuser les divisions héritées). Dire « </w:t>
+      </w:r>
+      <w:r>
+        <w:rPr>
+          <w:b/>
+          <w:bCs/>
+          <w:i w:val="false"/>
+          <w:iCs w:val="false"/>
+          <w:color w:val="1F4E79"/>
+          <w:sz w:val="24"/>
+          <w:szCs w:val="24"/>
+          <w:rFonts w:ascii="Times New Roman" w:cs="Times New Roman" w:eastAsia="Times New Roman" w:hAnsi="Times New Roman"/>
+        </w:rPr>
+        <w:t xml:space="preserve">groupe de population</w:t>
+      </w:r>
+      <w:r>
+        <w:rPr>
+          <w:b w:val="false"/>
+          <w:bCs w:val="false"/>
+          <w:i w:val="false"/>
+          <w:iCs w:val="false"/>
+          <w:color w:val="000000"/>
+          <w:sz w:val="24"/>
+          <w:szCs w:val="24"/>
+          <w:rFonts w:ascii="Times New Roman" w:cs="Times New Roman" w:eastAsia="Times New Roman" w:hAnsi="Times New Roman"/>
+        </w:rPr>
+        <w:t xml:space="preserve"> », c’est dire l’</w:t>
+      </w:r>
+      <w:r>
+        <w:rPr>
+          <w:b/>
+          <w:bCs/>
+          <w:i w:val="false"/>
+          <w:iCs w:val="false"/>
+          <w:color w:val="1F4E79"/>
+          <w:sz w:val="24"/>
+          <w:szCs w:val="24"/>
+          <w:rFonts w:ascii="Times New Roman" w:cs="Times New Roman" w:eastAsia="Times New Roman" w:hAnsi="Times New Roman"/>
+        </w:rPr>
+        <w:t xml:space="preserve">unité du peuple malgache</w:t>
+      </w:r>
+      <w:r>
+        <w:rPr>
+          <w:b w:val="false"/>
+          <w:bCs w:val="false"/>
+          <w:i w:val="false"/>
+          <w:iCs w:val="false"/>
+          <w:color w:val="000000"/>
+          <w:sz w:val="24"/>
+          <w:szCs w:val="24"/>
+          <w:rFonts w:ascii="Times New Roman" w:cs="Times New Roman" w:eastAsia="Times New Roman" w:hAnsi="Times New Roman"/>
+        </w:rPr>
+        <w:t xml:space="preserve">.</w:t>
       </w:r>
     </w:p>
     <w:p>
@@ -5764,8 +7373,331 @@
     </w:p>
     <w:p>
       <w:pPr>
-        <w:spacing w:before="200" w:after="150"/>
-        <w:jc w:val="left"/>
+        <w:spacing w:after="120"/>
+      </w:pPr>
+    </w:p>
+    <w:tbl>
+      <w:tblPr>
+        <w:tblW w:type="dxa" w:w="9600"/>
+        <w:tblBorders>
+          <w:top w:val="single" w:color="B25000" w:sz="12"/>
+          <w:left w:val="single" w:color="B25000" w:sz="12"/>
+          <w:bottom w:val="single" w:color="B25000" w:sz="12"/>
+          <w:right w:val="single" w:color="B25000" w:sz="12"/>
+          <w:insideH w:val="none"/>
+          <w:insideV w:val="none"/>
+        </w:tblBorders>
+        <w:tblLayout w:type="fixed"/>
+      </w:tblPr>
+      <w:tblGrid>
+        <w:gridCol w:w="9600"/>
+      </w:tblGrid>
+      <w:tr>
+        <w:tc>
+          <w:tcPr>
+            <w:shd w:fill="FFF8EF" w:val="clear"/>
+            <w:tcMar>
+              <w:top w:type="dxa" w:w="140"/>
+              <w:left w:type="dxa" w:w="180"/>
+              <w:bottom w:type="dxa" w:w="140"/>
+              <w:right w:type="dxa" w:w="180"/>
+            </w:tcMar>
+          </w:tcPr>
+          <w:p>
+            <w:pPr>
+              <w:spacing w:after="90"/>
+            </w:pPr>
+            <w:r>
+              <w:rPr>
+                <w:b/>
+                <w:bCs/>
+                <w:i w:val="false"/>
+                <w:iCs w:val="false"/>
+                <w:color w:val="B25000"/>
+                <w:sz w:val="25"/>
+                <w:szCs w:val="25"/>
+                <w:rFonts w:ascii="Times New Roman" w:cs="Times New Roman" w:eastAsia="Times New Roman" w:hAnsi="Times New Roman"/>
+              </w:rPr>
+              <w:t xml:space="preserve">Document à étudier</w:t>
+            </w:r>
+          </w:p>
+          <w:p>
+            <w:pPr>
+              <w:spacing w:after="80" w:line="300"/>
+              <w:jc w:val="left"/>
+            </w:pPr>
+            <w:r>
+              <w:rPr>
+                <w:b/>
+                <w:bCs/>
+                <w:i w:val="false"/>
+                <w:iCs w:val="false"/>
+                <w:color w:val="000000"/>
+                <w:sz w:val="21"/>
+                <w:szCs w:val="21"/>
+                <w:rFonts w:ascii="Times New Roman" w:cs="Times New Roman" w:eastAsia="Times New Roman" w:hAnsi="Times New Roman"/>
+              </w:rPr>
+              <w:t xml:space="preserve">La « politique des races » du colonisateur — d’après les instructions du général Gallieni, gouverneur de Madagascar (1898) — extrait adapté</w:t>
+            </w:r>
+          </w:p>
+          <w:p>
+            <w:pPr>
+              <w:spacing w:after="100" w:line="300"/>
+              <w:jc w:val="both"/>
+            </w:pPr>
+            <w:r>
+              <w:rPr>
+                <w:b w:val="false"/>
+                <w:bCs w:val="false"/>
+                <w:i/>
+                <w:iCs/>
+                <w:color w:val="000000"/>
+                <w:sz w:val="24"/>
+                <w:szCs w:val="24"/>
+                <w:rFonts w:ascii="Times New Roman" w:cs="Times New Roman" w:eastAsia="Times New Roman" w:hAnsi="Times New Roman"/>
+              </w:rPr>
+              <w:t xml:space="preserve">« L’action administrative doit s’appuyer sur ce que nous nommerons la politique des races : il convient de reconnaître les différentes populations de l’île, de les administrer séparément, chacune selon ses chefs et ses coutumes propres, et de ne point laisser l’une dominer les autres. Le gouvernement de la colonie traitera ainsi avec chaque groupe pris à part, au lieu de s’adresser à un peuple unique. »</w:t>
+            </w:r>
+          </w:p>
+          <w:p>
+            <w:pPr>
+              <w:spacing w:after="40" w:line="300"/>
+              <w:jc w:val="both"/>
+            </w:pPr>
+            <w:r>
+              <w:rPr>
+                <w:b w:val="false"/>
+                <w:bCs w:val="false"/>
+                <w:i w:val="false"/>
+                <w:iCs w:val="false"/>
+                <w:color w:val="000000"/>
+                <w:sz w:val="24"/>
+                <w:szCs w:val="24"/>
+                <w:rFonts w:ascii="Times New Roman" w:cs="Times New Roman" w:eastAsia="Times New Roman" w:hAnsi="Times New Roman"/>
+              </w:rPr>
+              <w:t xml:space="preserve">1. Que recommande la « politique des races » décrite dans ce texte ?</w:t>
+            </w:r>
+          </w:p>
+          <w:p>
+            <w:pPr>
+              <w:spacing w:after="40" w:line="300"/>
+              <w:jc w:val="both"/>
+            </w:pPr>
+            <w:r>
+              <w:rPr>
+                <w:b w:val="false"/>
+                <w:bCs w:val="false"/>
+                <w:i w:val="false"/>
+                <w:iCs w:val="false"/>
+                <w:color w:val="000000"/>
+                <w:sz w:val="24"/>
+                <w:szCs w:val="24"/>
+                <w:rFonts w:ascii="Times New Roman" w:cs="Times New Roman" w:eastAsia="Times New Roman" w:hAnsi="Times New Roman"/>
+              </w:rPr>
+              <w:t xml:space="preserve">2. Quel intérêt le pouvoir colonial trouve-t-il à « administrer séparément » les populations ?</w:t>
+            </w:r>
+          </w:p>
+          <w:p>
+            <w:pPr>
+              <w:spacing w:after="40" w:line="300"/>
+              <w:jc w:val="both"/>
+            </w:pPr>
+            <w:r>
+              <w:rPr>
+                <w:b w:val="false"/>
+                <w:bCs w:val="false"/>
+                <w:i w:val="false"/>
+                <w:iCs w:val="false"/>
+                <w:color w:val="000000"/>
+                <w:sz w:val="24"/>
+                <w:szCs w:val="24"/>
+                <w:rFonts w:ascii="Times New Roman" w:cs="Times New Roman" w:eastAsia="Times New Roman" w:hAnsi="Times New Roman"/>
+              </w:rPr>
+              <w:t xml:space="preserve">3. En quoi la leçon d’aujourd’hui répond-elle à ce document ?</w:t>
+            </w:r>
+          </w:p>
+          <w:p>
+            <w:pPr>
+              <w:spacing w:after="60"/>
+            </w:pPr>
+          </w:p>
+          <w:p>
+            <w:pPr>
+              <w:spacing w:after="40"/>
+            </w:pPr>
+            <w:r>
+              <w:rPr>
+                <w:b/>
+                <w:bCs/>
+                <w:i w:val="false"/>
+                <w:iCs w:val="false"/>
+                <w:color w:val="C2185B"/>
+                <w:sz w:val="22"/>
+                <w:szCs w:val="22"/>
+                <w:rFonts w:ascii="Times New Roman" w:cs="Times New Roman" w:eastAsia="Times New Roman" w:hAnsi="Times New Roman"/>
+              </w:rPr>
+              <w:t xml:space="preserve">Réponse 1. </w:t>
+            </w:r>
+            <w:r>
+              <w:rPr>
+                <w:b w:val="false"/>
+                <w:bCs w:val="false"/>
+                <w:i w:val="false"/>
+                <w:iCs w:val="false"/>
+                <w:color w:val="000000"/>
+                <w:sz w:val="22"/>
+                <w:szCs w:val="22"/>
+                <w:rFonts w:ascii="Times New Roman" w:cs="Times New Roman" w:eastAsia="Times New Roman" w:hAnsi="Times New Roman"/>
+              </w:rPr>
+              <w:t xml:space="preserve">Reconnaître des populations distinctes et les administrer séparément, chacune avec ses chefs et coutumes, sans s’adresser à un peuple unique.</w:t>
+            </w:r>
+          </w:p>
+          <w:p>
+            <w:pPr>
+              <w:spacing w:after="40"/>
+            </w:pPr>
+            <w:r>
+              <w:rPr>
+                <w:b/>
+                <w:bCs/>
+                <w:i w:val="false"/>
+                <w:iCs w:val="false"/>
+                <w:color w:val="C2185B"/>
+                <w:sz w:val="22"/>
+                <w:szCs w:val="22"/>
+                <w:rFonts w:ascii="Times New Roman" w:cs="Times New Roman" w:eastAsia="Times New Roman" w:hAnsi="Times New Roman"/>
+              </w:rPr>
+              <w:t xml:space="preserve">Réponse 2. </w:t>
+            </w:r>
+            <w:r>
+              <w:rPr>
+                <w:b w:val="false"/>
+                <w:bCs w:val="false"/>
+                <w:i w:val="false"/>
+                <w:iCs w:val="false"/>
+                <w:color w:val="000000"/>
+                <w:sz w:val="22"/>
+                <w:szCs w:val="22"/>
+                <w:rFonts w:ascii="Times New Roman" w:cs="Times New Roman" w:eastAsia="Times New Roman" w:hAnsi="Times New Roman"/>
+              </w:rPr>
+              <w:t xml:space="preserve">Diviser pour régner : des groupes traités à part s’unissent plus difficilement contre le colonisateur qu’un peuple reconnu comme un.</w:t>
+            </w:r>
+          </w:p>
+          <w:p>
+            <w:pPr>
+              <w:spacing w:after="40"/>
+            </w:pPr>
+            <w:r>
+              <w:rPr>
+                <w:b/>
+                <w:bCs/>
+                <w:i w:val="false"/>
+                <w:iCs w:val="false"/>
+                <w:color w:val="C2185B"/>
+                <w:sz w:val="22"/>
+                <w:szCs w:val="22"/>
+                <w:rFonts w:ascii="Times New Roman" w:cs="Times New Roman" w:eastAsia="Times New Roman" w:hAnsi="Times New Roman"/>
+              </w:rPr>
+              <w:t xml:space="preserve">Réponse 3. </w:t>
+            </w:r>
+            <w:r>
+              <w:rPr>
+                <w:b w:val="false"/>
+                <w:bCs w:val="false"/>
+                <w:i w:val="false"/>
+                <w:iCs w:val="false"/>
+                <w:color w:val="000000"/>
+                <w:sz w:val="22"/>
+                <w:szCs w:val="22"/>
+                <w:rFonts w:ascii="Times New Roman" w:cs="Times New Roman" w:eastAsia="Times New Roman" w:hAnsi="Times New Roman"/>
+              </w:rPr>
+              <w:t xml:space="preserve">La science montre qu’il n’y a ni ethnies ni tribus à Madagascar — une seule langue, un même brassage : abandonner ce vocabulaire colonial, c’est rétablir la vérité et l’unité du peuple malgache.</w:t>
+            </w:r>
+          </w:p>
+        </w:tc>
+      </w:tr>
+    </w:tbl>
+    <w:p>
+      <w:pPr>
+        <w:spacing w:after="160"/>
+      </w:pPr>
+    </w:p>
+    <w:tbl>
+      <w:tblPr>
+        <w:tblW w:type="dxa" w:w="9600"/>
+        <w:tblBorders>
+          <w:top w:val="single" w:color="1565C0" w:sz="12"/>
+          <w:left w:val="single" w:color="1565C0" w:sz="12"/>
+          <w:bottom w:val="single" w:color="1565C0" w:sz="12"/>
+          <w:right w:val="single" w:color="1565C0" w:sz="12"/>
+          <w:insideH w:val="none"/>
+          <w:insideV w:val="none"/>
+        </w:tblBorders>
+        <w:tblLayout w:type="fixed"/>
+      </w:tblPr>
+      <w:tblGrid>
+        <w:gridCol w:w="9600"/>
+      </w:tblGrid>
+      <w:tr>
+        <w:tc>
+          <w:tcPr>
+            <w:shd w:fill="E3F2FD" w:val="clear"/>
+            <w:tcMar>
+              <w:top w:type="dxa" w:w="140"/>
+              <w:left w:type="dxa" w:w="180"/>
+              <w:bottom w:type="dxa" w:w="140"/>
+              <w:right w:type="dxa" w:w="180"/>
+            </w:tcMar>
+          </w:tcPr>
+          <w:p>
+            <w:pPr>
+              <w:spacing w:after="90"/>
+            </w:pPr>
+            <w:r>
+              <w:rPr>
+                <w:b/>
+                <w:bCs/>
+                <w:i w:val="false"/>
+                <w:iCs w:val="false"/>
+                <w:color w:val="1565C0"/>
+                <w:sz w:val="25"/>
+                <w:szCs w:val="25"/>
+                <w:rFonts w:ascii="Times New Roman" w:cs="Times New Roman" w:eastAsia="Times New Roman" w:hAnsi="Times New Roman"/>
+              </w:rPr>
+              <w:t xml:space="preserve">Le savais-tu ?</w:t>
+            </w:r>
+          </w:p>
+          <w:p>
+            <w:pPr>
+              <w:spacing w:after="0" w:line="300"/>
+              <w:jc w:val="both"/>
+            </w:pPr>
+            <w:r>
+              <w:rPr>
+                <w:b w:val="false"/>
+                <w:bCs w:val="false"/>
+                <w:i w:val="false"/>
+                <w:iCs w:val="false"/>
+                <w:color w:val="000000"/>
+                <w:sz w:val="22"/>
+                <w:szCs w:val="22"/>
+                <w:rFonts w:ascii="Times New Roman" w:cs="Times New Roman" w:eastAsia="Times New Roman" w:hAnsi="Times New Roman"/>
+              </w:rPr>
+              <w:t xml:space="preserve">Le malgache est parlé par tous les habitants d’une île plus grande que la France — alors que la Papouasie-Nouvelle-Guinée, à peine plus petite, compte plus de 800 langues ! Cette unité linguistique exceptionnelle est l’un des arguments les plus forts des savants : Madagascar est bien le pays d’un seul peuple aux multiples visages.</w:t>
+            </w:r>
+          </w:p>
+        </w:tc>
+      </w:tr>
+    </w:tbl>
+    <w:p>
+      <w:pPr>
+        <w:spacing w:after="160"/>
+      </w:pPr>
+    </w:p>
+    <w:p>
+      <w:pPr>
+        <w:spacing w:after="80" w:line="300"/>
+        <w:jc w:val="both"/>
       </w:pPr>
       <w:r>
         <w:rPr>
@@ -5774,166 +7706,337 @@
           <w:i w:val="false"/>
           <w:iCs w:val="false"/>
           <w:color w:val="2E7D32"/>
-          <w:sz w:val="28"/>
-          <w:szCs w:val="28"/>
-          <w:rFonts w:ascii="Times New Roman" w:cs="Times New Roman" w:eastAsia="Times New Roman" w:hAnsi="Times New Roman"/>
-        </w:rPr>
-        <w:t xml:space="preserve">Méthode</w:t>
-      </w:r>
-    </w:p>
-    <w:p>
-      <w:pPr>
-        <w:spacing w:after="60" w:line="300"/>
-        <w:jc w:val="both"/>
-      </w:pPr>
-      <w:r>
-        <w:rPr>
-          <w:b w:val="false"/>
-          <w:bCs w:val="false"/>
-          <w:i w:val="false"/>
-          <w:iCs w:val="false"/>
-          <w:color w:val="000000"/>
-          <w:sz w:val="24"/>
-          <w:szCs w:val="24"/>
-          <w:rFonts w:ascii="Times New Roman" w:cs="Times New Roman" w:eastAsia="Times New Roman" w:hAnsi="Times New Roman"/>
-        </w:rPr>
-        <w:t xml:space="preserve">1. Réciter les trois définitions avec leur critère propre.</w:t>
-      </w:r>
-    </w:p>
-    <w:p>
-      <w:pPr>
-        <w:spacing w:after="60" w:line="300"/>
-        <w:jc w:val="both"/>
-      </w:pPr>
-      <w:r>
-        <w:rPr>
-          <w:b w:val="false"/>
-          <w:bCs w:val="false"/>
-          <w:i w:val="false"/>
-          <w:iCs w:val="false"/>
-          <w:color w:val="000000"/>
-          <w:sz w:val="24"/>
-          <w:szCs w:val="24"/>
-          <w:rFonts w:ascii="Times New Roman" w:cs="Times New Roman" w:eastAsia="Times New Roman" w:hAnsi="Times New Roman"/>
-        </w:rPr>
-        <w:t xml:space="preserve">2. Appliquer chaque critère au cas malgache (test de la langue, test de l’ancêtre).</w:t>
-      </w:r>
-    </w:p>
-    <w:p>
-      <w:pPr>
-        <w:spacing w:after="60" w:line="300"/>
-        <w:jc w:val="both"/>
-      </w:pPr>
-      <w:r>
-        <w:rPr>
-          <w:b w:val="false"/>
-          <w:bCs w:val="false"/>
-          <w:i w:val="false"/>
-          <w:iCs w:val="false"/>
-          <w:color w:val="000000"/>
-          <w:sz w:val="24"/>
-          <w:szCs w:val="24"/>
-          <w:rFonts w:ascii="Times New Roman" w:cs="Times New Roman" w:eastAsia="Times New Roman" w:hAnsi="Times New Roman"/>
-        </w:rPr>
-        <w:t xml:space="preserve">3. Conclure avec le vocabulaire juste et expliquer pourquoi il importe.</w:t>
-      </w:r>
-    </w:p>
-    <w:p>
-      <w:pPr>
-        <w:spacing w:after="110" w:line="300"/>
-        <w:jc w:val="both"/>
-      </w:pPr>
-      <w:r>
-        <w:rPr>
-          <w:b/>
-          <w:bCs/>
-          <w:i w:val="false"/>
-          <w:iCs w:val="false"/>
-          <w:color w:val="1F4E79"/>
-          <w:sz w:val="24"/>
-          <w:szCs w:val="24"/>
-          <w:rFonts w:ascii="Times New Roman" w:cs="Times New Roman" w:eastAsia="Times New Roman" w:hAnsi="Times New Roman"/>
-        </w:rPr>
-        <w:t xml:space="preserve">Exemple — </w:t>
-      </w:r>
-      <w:r>
-        <w:rPr>
-          <w:b w:val="false"/>
-          <w:bCs w:val="false"/>
-          <w:i w:val="false"/>
-          <w:iCs w:val="false"/>
-          <w:color w:val="000000"/>
-          <w:sz w:val="24"/>
-          <w:szCs w:val="24"/>
-          <w:rFonts w:ascii="Times New Roman" w:cs="Times New Roman" w:eastAsia="Times New Roman" w:hAnsi="Times New Roman"/>
-        </w:rPr>
-        <w:t xml:space="preserve">Un journaliste écrit « l’ethnie vezo » ; l’élève historien corrige : les Vezo parlent malgache et partagent la culture commune — ce sont un groupe de population défini par la vie en mer, non une ethnie.</w:t>
-      </w:r>
-    </w:p>
-    <w:p>
-      <w:pPr>
-        <w:spacing w:after="110" w:line="300"/>
-        <w:jc w:val="both"/>
-      </w:pPr>
-      <w:r>
-        <w:rPr>
-          <w:b/>
-          <w:bCs/>
-          <w:i w:val="false"/>
-          <w:iCs w:val="false"/>
-          <w:color w:val="B25000"/>
-          <w:sz w:val="24"/>
-          <w:szCs w:val="24"/>
-          <w:rFonts w:ascii="Times New Roman" w:cs="Times New Roman" w:eastAsia="Times New Roman" w:hAnsi="Times New Roman"/>
-        </w:rPr>
-        <w:t xml:space="preserve">Erreur à éviter — </w:t>
-      </w:r>
-      <w:r>
-        <w:rPr>
-          <w:b w:val="false"/>
-          <w:bCs w:val="false"/>
-          <w:i w:val="false"/>
-          <w:iCs w:val="false"/>
-          <w:color w:val="000000"/>
-          <w:sz w:val="24"/>
-          <w:szCs w:val="24"/>
-          <w:rFonts w:ascii="Times New Roman" w:cs="Times New Roman" w:eastAsia="Times New Roman" w:hAnsi="Times New Roman"/>
-        </w:rPr>
-        <w:t xml:space="preserve">Répéter « les dix-huit tribus de Madagascar » : ce classement, popularisé à l’époque coloniale, ne résiste ni au test de la langue ni à celui de l’ancêtre commun. La science dit : des groupes de population d’un seul peuple.</w:t>
-      </w:r>
-    </w:p>
-    <w:p>
-      <w:pPr>
-        <w:shd w:fill="E3F2FD" w:val="clear"/>
-        <w:spacing w:after="110" w:line="300"/>
-        <w:jc w:val="both"/>
-      </w:pPr>
-      <w:r>
-        <w:rPr>
-          <w:b/>
-          <w:bCs/>
-          <w:i w:val="false"/>
-          <w:iCs w:val="false"/>
-          <w:color w:val="1565C0"/>
-          <w:sz w:val="24"/>
-          <w:szCs w:val="24"/>
-          <w:rFonts w:ascii="Times New Roman" w:cs="Times New Roman" w:eastAsia="Times New Roman" w:hAnsi="Times New Roman"/>
-        </w:rPr>
-        <w:t xml:space="preserve">Le savais-tu ? </w:t>
-      </w:r>
-      <w:r>
-        <w:rPr>
-          <w:b w:val="false"/>
-          <w:bCs w:val="false"/>
-          <w:i w:val="false"/>
-          <w:iCs w:val="false"/>
-          <w:color w:val="000000"/>
-          <w:sz w:val="24"/>
-          <w:szCs w:val="24"/>
-          <w:rFonts w:ascii="Times New Roman" w:cs="Times New Roman" w:eastAsia="Times New Roman" w:hAnsi="Times New Roman"/>
-        </w:rPr>
-        <w:t xml:space="preserve">Le malgache est parlé par tous les habitants d’une île plus grande que la France — alors que la Papouasie-Nouvelle-Guinée, à peine plus petite, compte plus de 800 langues ! Cette unité linguistique exceptionnelle est l’un des arguments les plus forts des savants : Madagascar est bien le pays d’un seul peuple aux multiples visages.</w:t>
-      </w:r>
+          <w:sz w:val="26"/>
+          <w:szCs w:val="26"/>
+          <w:rFonts w:ascii="Times New Roman" w:cs="Times New Roman" w:eastAsia="Times New Roman" w:hAnsi="Times New Roman"/>
+        </w:rPr>
+        <w:t xml:space="preserve">Petit lexique</w:t>
+      </w:r>
+    </w:p>
+    <w:tbl>
+      <w:tblPr>
+        <w:tblW w:type="dxa" w:w="9600"/>
+        <w:tblBorders>
+          <w:top w:val="single" w:color="808080" w:sz="4"/>
+          <w:left w:val="single" w:color="808080" w:sz="4"/>
+          <w:bottom w:val="single" w:color="808080" w:sz="4"/>
+          <w:right w:val="single" w:color="808080" w:sz="4"/>
+          <w:insideH w:val="single" w:color="B0B0B0" w:sz="4"/>
+          <w:insideV w:val="single" w:color="B0B0B0" w:sz="4"/>
+        </w:tblBorders>
+        <w:tblLayout w:type="fixed"/>
+      </w:tblPr>
+      <w:tblGrid>
+        <w:gridCol w:w="2800"/>
+        <w:gridCol w:w="6800"/>
+      </w:tblGrid>
+      <w:tr>
+        <w:tc>
+          <w:tcPr>
+            <w:shd w:fill="E7E6E6" w:val="clear"/>
+            <w:tcMar>
+              <w:top w:type="dxa" w:w="80"/>
+              <w:left w:type="dxa" w:w="80"/>
+              <w:bottom w:type="dxa" w:w="80"/>
+              <w:right w:type="dxa" w:w="80"/>
+            </w:tcMar>
+          </w:tcPr>
+          <w:p>
+            <w:pPr>
+              <w:spacing w:after="40"/>
+              <w:jc w:val="left"/>
+            </w:pPr>
+            <w:r>
+              <w:rPr>
+                <w:b/>
+                <w:bCs/>
+                <w:i w:val="false"/>
+                <w:iCs w:val="false"/>
+                <w:color w:val="000000"/>
+                <w:sz w:val="20"/>
+                <w:szCs w:val="20"/>
+                <w:rFonts w:ascii="Times New Roman" w:cs="Times New Roman" w:eastAsia="Times New Roman" w:hAnsi="Times New Roman"/>
+              </w:rPr>
+              <w:t xml:space="preserve">Mot</w:t>
+            </w:r>
+          </w:p>
+        </w:tc>
+        <w:tc>
+          <w:tcPr>
+            <w:shd w:fill="E7E6E6" w:val="clear"/>
+            <w:tcMar>
+              <w:top w:type="dxa" w:w="80"/>
+              <w:left w:type="dxa" w:w="80"/>
+              <w:bottom w:type="dxa" w:w="80"/>
+              <w:right w:type="dxa" w:w="80"/>
+            </w:tcMar>
+          </w:tcPr>
+          <w:p>
+            <w:pPr>
+              <w:spacing w:after="40"/>
+              <w:jc w:val="left"/>
+            </w:pPr>
+            <w:r>
+              <w:rPr>
+                <w:b/>
+                <w:bCs/>
+                <w:i w:val="false"/>
+                <w:iCs w:val="false"/>
+                <w:color w:val="000000"/>
+                <w:sz w:val="20"/>
+                <w:szCs w:val="20"/>
+                <w:rFonts w:ascii="Times New Roman" w:cs="Times New Roman" w:eastAsia="Times New Roman" w:hAnsi="Times New Roman"/>
+              </w:rPr>
+              <w:t xml:space="preserve">Sens</w:t>
+            </w:r>
+          </w:p>
+        </w:tc>
+      </w:tr>
+      <w:tr>
+        <w:tc>
+          <w:tcPr>
+            <w:tcMar>
+              <w:top w:type="dxa" w:w="80"/>
+              <w:left w:type="dxa" w:w="80"/>
+              <w:bottom w:type="dxa" w:w="80"/>
+              <w:right w:type="dxa" w:w="80"/>
+            </w:tcMar>
+          </w:tcPr>
+          <w:p>
+            <w:pPr>
+              <w:spacing w:after="40"/>
+              <w:jc w:val="left"/>
+            </w:pPr>
+            <w:r>
+              <w:rPr>
+                <w:b/>
+                <w:bCs/>
+                <w:i w:val="false"/>
+                <w:iCs w:val="false"/>
+                <w:color w:val="000000"/>
+                <w:sz w:val="20"/>
+                <w:szCs w:val="20"/>
+                <w:rFonts w:ascii="Times New Roman" w:cs="Times New Roman" w:eastAsia="Times New Roman" w:hAnsi="Times New Roman"/>
+              </w:rPr>
+              <w:t xml:space="preserve">Ethnie</w:t>
+            </w:r>
+          </w:p>
+        </w:tc>
+        <w:tc>
+          <w:tcPr>
+            <w:tcMar>
+              <w:top w:type="dxa" w:w="80"/>
+              <w:left w:type="dxa" w:w="80"/>
+              <w:bottom w:type="dxa" w:w="80"/>
+              <w:right w:type="dxa" w:w="80"/>
+            </w:tcMar>
+          </w:tcPr>
+          <w:p>
+            <w:pPr>
+              <w:spacing w:after="40"/>
+              <w:jc w:val="left"/>
+            </w:pPr>
+            <w:r>
+              <w:rPr>
+                <w:b w:val="false"/>
+                <w:bCs w:val="false"/>
+                <w:i w:val="false"/>
+                <w:iCs w:val="false"/>
+                <w:color w:val="000000"/>
+                <w:sz w:val="20"/>
+                <w:szCs w:val="20"/>
+                <w:rFonts w:ascii="Times New Roman" w:cs="Times New Roman" w:eastAsia="Times New Roman" w:hAnsi="Times New Roman"/>
+              </w:rPr>
+              <w:t xml:space="preserve">peuple ayant sa propre langue et sa propre culture</w:t>
+            </w:r>
+          </w:p>
+        </w:tc>
+      </w:tr>
+      <w:tr>
+        <w:tc>
+          <w:tcPr>
+            <w:tcMar>
+              <w:top w:type="dxa" w:w="80"/>
+              <w:left w:type="dxa" w:w="80"/>
+              <w:bottom w:type="dxa" w:w="80"/>
+              <w:right w:type="dxa" w:w="80"/>
+            </w:tcMar>
+          </w:tcPr>
+          <w:p>
+            <w:pPr>
+              <w:spacing w:after="40"/>
+              <w:jc w:val="left"/>
+            </w:pPr>
+            <w:r>
+              <w:rPr>
+                <w:b/>
+                <w:bCs/>
+                <w:i w:val="false"/>
+                <w:iCs w:val="false"/>
+                <w:color w:val="000000"/>
+                <w:sz w:val="20"/>
+                <w:szCs w:val="20"/>
+                <w:rFonts w:ascii="Times New Roman" w:cs="Times New Roman" w:eastAsia="Times New Roman" w:hAnsi="Times New Roman"/>
+              </w:rPr>
+              <w:t xml:space="preserve">Tribu</w:t>
+            </w:r>
+          </w:p>
+        </w:tc>
+        <w:tc>
+          <w:tcPr>
+            <w:tcMar>
+              <w:top w:type="dxa" w:w="80"/>
+              <w:left w:type="dxa" w:w="80"/>
+              <w:bottom w:type="dxa" w:w="80"/>
+              <w:right w:type="dxa" w:w="80"/>
+            </w:tcMar>
+          </w:tcPr>
+          <w:p>
+            <w:pPr>
+              <w:spacing w:after="40"/>
+              <w:jc w:val="left"/>
+            </w:pPr>
+            <w:r>
+              <w:rPr>
+                <w:b w:val="false"/>
+                <w:bCs w:val="false"/>
+                <w:i w:val="false"/>
+                <w:iCs w:val="false"/>
+                <w:color w:val="000000"/>
+                <w:sz w:val="20"/>
+                <w:szCs w:val="20"/>
+                <w:rFonts w:ascii="Times New Roman" w:cs="Times New Roman" w:eastAsia="Times New Roman" w:hAnsi="Times New Roman"/>
+              </w:rPr>
+              <w:t xml:space="preserve">groupe uni par la descendance d’un ancêtre commun</w:t>
+            </w:r>
+          </w:p>
+        </w:tc>
+      </w:tr>
+      <w:tr>
+        <w:tc>
+          <w:tcPr>
+            <w:tcMar>
+              <w:top w:type="dxa" w:w="80"/>
+              <w:left w:type="dxa" w:w="80"/>
+              <w:bottom w:type="dxa" w:w="80"/>
+              <w:right w:type="dxa" w:w="80"/>
+            </w:tcMar>
+          </w:tcPr>
+          <w:p>
+            <w:pPr>
+              <w:spacing w:after="40"/>
+              <w:jc w:val="left"/>
+            </w:pPr>
+            <w:r>
+              <w:rPr>
+                <w:b/>
+                <w:bCs/>
+                <w:i w:val="false"/>
+                <w:iCs w:val="false"/>
+                <w:color w:val="000000"/>
+                <w:sz w:val="20"/>
+                <w:szCs w:val="20"/>
+                <w:rFonts w:ascii="Times New Roman" w:cs="Times New Roman" w:eastAsia="Times New Roman" w:hAnsi="Times New Roman"/>
+              </w:rPr>
+              <w:t xml:space="preserve">Groupe de population</w:t>
+            </w:r>
+          </w:p>
+        </w:tc>
+        <w:tc>
+          <w:tcPr>
+            <w:tcMar>
+              <w:top w:type="dxa" w:w="80"/>
+              <w:left w:type="dxa" w:w="80"/>
+              <w:bottom w:type="dxa" w:w="80"/>
+              <w:right w:type="dxa" w:w="80"/>
+            </w:tcMar>
+          </w:tcPr>
+          <w:p>
+            <w:pPr>
+              <w:spacing w:after="40"/>
+              <w:jc w:val="left"/>
+            </w:pPr>
+            <w:r>
+              <w:rPr>
+                <w:b w:val="false"/>
+                <w:bCs w:val="false"/>
+                <w:i w:val="false"/>
+                <w:iCs w:val="false"/>
+                <w:color w:val="000000"/>
+                <w:sz w:val="20"/>
+                <w:szCs w:val="20"/>
+                <w:rFonts w:ascii="Times New Roman" w:cs="Times New Roman" w:eastAsia="Times New Roman" w:hAnsi="Times New Roman"/>
+              </w:rPr>
+              <w:t xml:space="preserve">habitants d’une même région aux coutumes locales</w:t>
+            </w:r>
+          </w:p>
+        </w:tc>
+      </w:tr>
+      <w:tr>
+        <w:tc>
+          <w:tcPr>
+            <w:tcMar>
+              <w:top w:type="dxa" w:w="80"/>
+              <w:left w:type="dxa" w:w="80"/>
+              <w:bottom w:type="dxa" w:w="80"/>
+              <w:right w:type="dxa" w:w="80"/>
+            </w:tcMar>
+          </w:tcPr>
+          <w:p>
+            <w:pPr>
+              <w:spacing w:after="40"/>
+              <w:jc w:val="left"/>
+            </w:pPr>
+            <w:r>
+              <w:rPr>
+                <w:b/>
+                <w:bCs/>
+                <w:i w:val="false"/>
+                <w:iCs w:val="false"/>
+                <w:color w:val="000000"/>
+                <w:sz w:val="20"/>
+                <w:szCs w:val="20"/>
+                <w:rFonts w:ascii="Times New Roman" w:cs="Times New Roman" w:eastAsia="Times New Roman" w:hAnsi="Times New Roman"/>
+              </w:rPr>
+              <w:t xml:space="preserve">Politique des races</w:t>
+            </w:r>
+          </w:p>
+        </w:tc>
+        <w:tc>
+          <w:tcPr>
+            <w:tcMar>
+              <w:top w:type="dxa" w:w="80"/>
+              <w:left w:type="dxa" w:w="80"/>
+              <w:bottom w:type="dxa" w:w="80"/>
+              <w:right w:type="dxa" w:w="80"/>
+            </w:tcMar>
+          </w:tcPr>
+          <w:p>
+            <w:pPr>
+              <w:spacing w:after="40"/>
+              <w:jc w:val="left"/>
+            </w:pPr>
+            <w:r>
+              <w:rPr>
+                <w:b w:val="false"/>
+                <w:bCs w:val="false"/>
+                <w:i w:val="false"/>
+                <w:iCs w:val="false"/>
+                <w:color w:val="000000"/>
+                <w:sz w:val="20"/>
+                <w:szCs w:val="20"/>
+                <w:rFonts w:ascii="Times New Roman" w:cs="Times New Roman" w:eastAsia="Times New Roman" w:hAnsi="Times New Roman"/>
+              </w:rPr>
+              <w:t xml:space="preserve">méthode coloniale consistant à diviser pour régner</w:t>
+            </w:r>
+          </w:p>
+        </w:tc>
+      </w:tr>
+    </w:tbl>
+    <w:p>
+      <w:pPr>
+        <w:spacing w:after="120"/>
+      </w:pPr>
     </w:p>
     <w:p>
       <w:pPr>

</xml_diff>